<commit_message>
Se terminó la documentacion del modelo físico de los RF-8 Y RF-9 del modulo
</commit_message>
<xml_diff>
--- a/Docs/Proyecto 1 Documentación.docx
+++ b/Docs/Proyecto 1 Documentación.docx
@@ -961,7 +961,7 @@
           <w:rFonts w:ascii="Arial Unicode MS" w:cs="Arial Unicode MS" w:eastAsia="Arial Unicode MS" w:hAnsi="Arial Unicode MS"/>
           <w:rtl w:val="0"/>
         </w:rPr>
-        <w:t xml:space="preserve">(FK: id_usuario_propietario → USUARIOS) *Nota: id_usuario_propietario=id_usuario</w:t>
+        <w:t xml:space="preserve">(FK: id_usuario_propietario → USUARIOS)</w:t>
       </w:r>
     </w:p>
     <w:p>
@@ -992,19 +992,7 @@
           <w:rFonts w:ascii="Arial Unicode MS" w:cs="Arial Unicode MS" w:eastAsia="Arial Unicode MS" w:hAnsi="Arial Unicode MS"/>
           <w:rtl w:val="0"/>
         </w:rPr>
-        <w:t xml:space="preserve">(FK: id_usuario_invitado → USUARIOS) (FK: id_evento → EVENTOS)</w:t>
-      </w:r>
-    </w:p>
-    <w:p>
-      <w:pPr>
-        <w:ind w:left="720" w:firstLine="0"/>
-        <w:rPr/>
-      </w:pPr>
-      <w:r>
-        <w:rPr>
-          <w:rtl w:val="0"/>
-        </w:rPr>
-        <w:t xml:space="preserve">*Nota: id_usuario_invitado = id_usuario</w:t>
+        <w:t xml:space="preserve">(FK: id_invitado → USUARIOS) (FK: id_evento → EVENTOS)</w:t>
       </w:r>
     </w:p>
     <w:p>
@@ -1014,12 +1002,16 @@
           <w:numId w:val="2"/>
         </w:numPr>
         <w:ind w:left="720" w:hanging="360"/>
-      </w:pPr>
-      <w:r>
-        <w:rPr>
-          <w:rtl w:val="0"/>
-        </w:rPr>
-        <w:t xml:space="preserve">BITACORA_ACCESOS (id_log[PK], fecha_acceso, id_usuario [FK])</w:t>
+        <w:rPr>
+          <w:u w:val="none"/>
+        </w:rPr>
+      </w:pPr>
+      <w:r>
+        <w:rPr>
+          <w:rFonts w:ascii="Arial Unicode MS" w:cs="Arial Unicode MS" w:eastAsia="Arial Unicode MS" w:hAnsi="Arial Unicode MS"/>
+          <w:rtl w:val="0"/>
+        </w:rPr>
+        <w:t xml:space="preserve">BITACORA_ACCESOS (id_log[PK], fecha_acceso, id_usuario [FK]) (FK: id_usuario → USUARIOS</w:t>
       </w:r>
     </w:p>
     <w:p>
@@ -1043,7 +1035,6 @@
         <w:rPr>
           <w:rtl w:val="0"/>
         </w:rPr>
-        <w:t xml:space="preserve"> </w:t>
       </w:r>
     </w:p>
     <w:p>
@@ -1103,12 +1094,1064 @@
         <w:rPr>
           <w:rtl w:val="0"/>
         </w:rPr>
-        <w:t xml:space="preserve">Se hicieron ciertas correcciones respecto al modelo logico base para el entendimiento del estudiante.</w:t>
-      </w:r>
-    </w:p>
-    <w:p>
-      <w:pPr>
-        <w:ind w:left="720" w:firstLine="0"/>
+        <w:t xml:space="preserve">Se hicieron ciertas correcciones respecto al modelo lógico base para el entendimiento del estudiante.</w:t>
+      </w:r>
+    </w:p>
+    <w:p>
+      <w:pPr>
+        <w:rPr/>
+      </w:pPr>
+      <w:r>
+        <w:rPr>
+          <w:rtl w:val="0"/>
+        </w:rPr>
+      </w:r>
+    </w:p>
+    <w:p>
+      <w:pPr>
+        <w:rPr/>
+      </w:pPr>
+      <w:r>
+        <w:rPr>
+          <w:rtl w:val="0"/>
+        </w:rPr>
+        <w:t xml:space="preserve">Modelo Físico</w:t>
+      </w:r>
+    </w:p>
+    <w:p>
+      <w:pPr>
+        <w:rPr/>
+      </w:pPr>
+      <w:r>
+        <w:rPr>
+          <w:rtl w:val="0"/>
+        </w:rPr>
+      </w:r>
+    </w:p>
+    <w:tbl>
+      <w:tblPr>
+        <w:tblStyle w:val="Table1"/>
+        <w:tblW w:w="9029.0" w:type="dxa"/>
+        <w:jc w:val="left"/>
+        <w:tblBorders>
+          <w:top w:color="000000" w:space="0" w:sz="8" w:val="single"/>
+          <w:left w:color="000000" w:space="0" w:sz="8" w:val="single"/>
+          <w:bottom w:color="000000" w:space="0" w:sz="8" w:val="single"/>
+          <w:right w:color="000000" w:space="0" w:sz="8" w:val="single"/>
+          <w:insideH w:color="000000" w:space="0" w:sz="8" w:val="single"/>
+          <w:insideV w:color="000000" w:space="0" w:sz="8" w:val="single"/>
+        </w:tblBorders>
+        <w:tblLayout w:type="fixed"/>
+        <w:tblLook w:val="0600"/>
+      </w:tblPr>
+      <w:tblGrid>
+        <w:gridCol w:w="2257.25"/>
+        <w:gridCol w:w="2257.25"/>
+        <w:gridCol w:w="2257.25"/>
+        <w:gridCol w:w="2257.25"/>
+        <w:tblGridChange w:id="0">
+          <w:tblGrid>
+            <w:gridCol w:w="2257.25"/>
+            <w:gridCol w:w="2257.25"/>
+            <w:gridCol w:w="2257.25"/>
+            <w:gridCol w:w="2257.25"/>
+          </w:tblGrid>
+        </w:tblGridChange>
+      </w:tblGrid>
+      <w:tr>
+        <w:trPr>
+          <w:cantSplit w:val="0"/>
+          <w:trHeight w:val="477.978515625" w:hRule="atLeast"/>
+          <w:tblHeader w:val="0"/>
+        </w:trPr>
+        <w:tc>
+          <w:tcPr>
+            <w:shd w:fill="auto" w:val="clear"/>
+            <w:tcMar>
+              <w:top w:w="100.0" w:type="dxa"/>
+              <w:left w:w="100.0" w:type="dxa"/>
+              <w:bottom w:w="100.0" w:type="dxa"/>
+              <w:right w:w="100.0" w:type="dxa"/>
+            </w:tcMar>
+            <w:vAlign w:val="top"/>
+          </w:tcPr>
+          <w:p>
+            <w:pPr>
+              <w:keepNext w:val="0"/>
+              <w:keepLines w:val="0"/>
+              <w:pageBreakBefore w:val="0"/>
+              <w:widowControl w:val="0"/>
+              <w:pBdr>
+                <w:top w:space="0" w:sz="0" w:val="nil"/>
+                <w:left w:space="0" w:sz="0" w:val="nil"/>
+                <w:bottom w:space="0" w:sz="0" w:val="nil"/>
+                <w:right w:space="0" w:sz="0" w:val="nil"/>
+                <w:between w:space="0" w:sz="0" w:val="nil"/>
+              </w:pBdr>
+              <w:shd w:fill="auto" w:val="clear"/>
+              <w:spacing w:after="0" w:before="0" w:line="240" w:lineRule="auto"/>
+              <w:ind w:left="0" w:right="0" w:firstLine="0"/>
+              <w:jc w:val="left"/>
+              <w:rPr/>
+            </w:pPr>
+            <w:r>
+              <w:rPr>
+                <w:rtl w:val="0"/>
+              </w:rPr>
+              <w:t xml:space="preserve">Tabla</w:t>
+            </w:r>
+          </w:p>
+        </w:tc>
+        <w:tc>
+          <w:tcPr>
+            <w:shd w:fill="auto" w:val="clear"/>
+            <w:tcMar>
+              <w:top w:w="100.0" w:type="dxa"/>
+              <w:left w:w="100.0" w:type="dxa"/>
+              <w:bottom w:w="100.0" w:type="dxa"/>
+              <w:right w:w="100.0" w:type="dxa"/>
+            </w:tcMar>
+            <w:vAlign w:val="top"/>
+          </w:tcPr>
+          <w:p>
+            <w:pPr>
+              <w:keepNext w:val="0"/>
+              <w:keepLines w:val="0"/>
+              <w:pageBreakBefore w:val="0"/>
+              <w:widowControl w:val="0"/>
+              <w:pBdr>
+                <w:top w:space="0" w:sz="0" w:val="nil"/>
+                <w:left w:space="0" w:sz="0" w:val="nil"/>
+                <w:bottom w:space="0" w:sz="0" w:val="nil"/>
+                <w:right w:space="0" w:sz="0" w:val="nil"/>
+                <w:between w:space="0" w:sz="0" w:val="nil"/>
+              </w:pBdr>
+              <w:shd w:fill="auto" w:val="clear"/>
+              <w:spacing w:after="0" w:before="0" w:line="240" w:lineRule="auto"/>
+              <w:ind w:left="0" w:right="0" w:firstLine="0"/>
+              <w:jc w:val="left"/>
+              <w:rPr/>
+            </w:pPr>
+            <w:r>
+              <w:rPr>
+                <w:rtl w:val="0"/>
+              </w:rPr>
+              <w:t xml:space="preserve">Columna</w:t>
+            </w:r>
+          </w:p>
+        </w:tc>
+        <w:tc>
+          <w:tcPr>
+            <w:shd w:fill="auto" w:val="clear"/>
+            <w:tcMar>
+              <w:top w:w="100.0" w:type="dxa"/>
+              <w:left w:w="100.0" w:type="dxa"/>
+              <w:bottom w:w="100.0" w:type="dxa"/>
+              <w:right w:w="100.0" w:type="dxa"/>
+            </w:tcMar>
+            <w:vAlign w:val="top"/>
+          </w:tcPr>
+          <w:p>
+            <w:pPr>
+              <w:keepNext w:val="0"/>
+              <w:keepLines w:val="0"/>
+              <w:pageBreakBefore w:val="0"/>
+              <w:widowControl w:val="0"/>
+              <w:pBdr>
+                <w:top w:space="0" w:sz="0" w:val="nil"/>
+                <w:left w:space="0" w:sz="0" w:val="nil"/>
+                <w:bottom w:space="0" w:sz="0" w:val="nil"/>
+                <w:right w:space="0" w:sz="0" w:val="nil"/>
+                <w:between w:space="0" w:sz="0" w:val="nil"/>
+              </w:pBdr>
+              <w:shd w:fill="auto" w:val="clear"/>
+              <w:spacing w:after="0" w:before="0" w:line="240" w:lineRule="auto"/>
+              <w:ind w:left="0" w:right="0" w:firstLine="0"/>
+              <w:jc w:val="left"/>
+              <w:rPr/>
+            </w:pPr>
+            <w:r>
+              <w:rPr>
+                <w:rtl w:val="0"/>
+              </w:rPr>
+              <w:t xml:space="preserve">Tipo de dato</w:t>
+            </w:r>
+          </w:p>
+        </w:tc>
+        <w:tc>
+          <w:tcPr>
+            <w:shd w:fill="auto" w:val="clear"/>
+            <w:tcMar>
+              <w:top w:w="100.0" w:type="dxa"/>
+              <w:left w:w="100.0" w:type="dxa"/>
+              <w:bottom w:w="100.0" w:type="dxa"/>
+              <w:right w:w="100.0" w:type="dxa"/>
+            </w:tcMar>
+            <w:vAlign w:val="top"/>
+          </w:tcPr>
+          <w:p>
+            <w:pPr>
+              <w:keepNext w:val="0"/>
+              <w:keepLines w:val="0"/>
+              <w:pageBreakBefore w:val="0"/>
+              <w:widowControl w:val="0"/>
+              <w:pBdr>
+                <w:top w:space="0" w:sz="0" w:val="nil"/>
+                <w:left w:space="0" w:sz="0" w:val="nil"/>
+                <w:bottom w:space="0" w:sz="0" w:val="nil"/>
+                <w:right w:space="0" w:sz="0" w:val="nil"/>
+                <w:between w:space="0" w:sz="0" w:val="nil"/>
+              </w:pBdr>
+              <w:shd w:fill="auto" w:val="clear"/>
+              <w:spacing w:after="0" w:before="0" w:line="240" w:lineRule="auto"/>
+              <w:ind w:left="0" w:right="0" w:firstLine="0"/>
+              <w:jc w:val="left"/>
+              <w:rPr/>
+            </w:pPr>
+            <w:r>
+              <w:rPr>
+                <w:rtl w:val="0"/>
+              </w:rPr>
+              <w:t xml:space="preserve">Constraints</w:t>
+            </w:r>
+          </w:p>
+        </w:tc>
+      </w:tr>
+      <w:tr>
+        <w:trPr>
+          <w:cantSplit w:val="0"/>
+          <w:trHeight w:val="585" w:hRule="atLeast"/>
+          <w:tblHeader w:val="0"/>
+        </w:trPr>
+        <w:tc>
+          <w:tcPr>
+            <w:vMerge w:val="restart"/>
+            <w:shd w:fill="auto" w:val="clear"/>
+            <w:tcMar>
+              <w:top w:w="100.0" w:type="dxa"/>
+              <w:left w:w="100.0" w:type="dxa"/>
+              <w:bottom w:w="100.0" w:type="dxa"/>
+              <w:right w:w="100.0" w:type="dxa"/>
+            </w:tcMar>
+            <w:vAlign w:val="top"/>
+          </w:tcPr>
+          <w:p>
+            <w:pPr>
+              <w:keepNext w:val="0"/>
+              <w:keepLines w:val="0"/>
+              <w:pageBreakBefore w:val="0"/>
+              <w:widowControl w:val="0"/>
+              <w:pBdr>
+                <w:top w:space="0" w:sz="0" w:val="nil"/>
+                <w:left w:space="0" w:sz="0" w:val="nil"/>
+                <w:bottom w:space="0" w:sz="0" w:val="nil"/>
+                <w:right w:space="0" w:sz="0" w:val="nil"/>
+                <w:between w:space="0" w:sz="0" w:val="nil"/>
+              </w:pBdr>
+              <w:shd w:fill="auto" w:val="clear"/>
+              <w:spacing w:after="0" w:before="0" w:line="240" w:lineRule="auto"/>
+              <w:ind w:left="0" w:right="0" w:firstLine="0"/>
+              <w:jc w:val="left"/>
+              <w:rPr/>
+            </w:pPr>
+            <w:r>
+              <w:rPr>
+                <w:rtl w:val="0"/>
+              </w:rPr>
+              <w:t xml:space="preserve">Ubicaciones</w:t>
+            </w:r>
+          </w:p>
+        </w:tc>
+        <w:tc>
+          <w:tcPr>
+            <w:shd w:fill="auto" w:val="clear"/>
+            <w:tcMar>
+              <w:top w:w="100.0" w:type="dxa"/>
+              <w:left w:w="100.0" w:type="dxa"/>
+              <w:bottom w:w="100.0" w:type="dxa"/>
+              <w:right w:w="100.0" w:type="dxa"/>
+            </w:tcMar>
+            <w:vAlign w:val="top"/>
+          </w:tcPr>
+          <w:p>
+            <w:pPr>
+              <w:keepNext w:val="0"/>
+              <w:keepLines w:val="0"/>
+              <w:pageBreakBefore w:val="0"/>
+              <w:widowControl w:val="0"/>
+              <w:pBdr>
+                <w:top w:space="0" w:sz="0" w:val="nil"/>
+                <w:left w:space="0" w:sz="0" w:val="nil"/>
+                <w:bottom w:space="0" w:sz="0" w:val="nil"/>
+                <w:right w:space="0" w:sz="0" w:val="nil"/>
+                <w:between w:space="0" w:sz="0" w:val="nil"/>
+              </w:pBdr>
+              <w:shd w:fill="auto" w:val="clear"/>
+              <w:spacing w:after="0" w:before="0" w:line="240" w:lineRule="auto"/>
+              <w:ind w:left="0" w:right="0" w:firstLine="0"/>
+              <w:jc w:val="left"/>
+              <w:rPr/>
+            </w:pPr>
+            <w:r>
+              <w:rPr>
+                <w:rtl w:val="0"/>
+              </w:rPr>
+              <w:t xml:space="preserve">id_ubicacion</w:t>
+            </w:r>
+          </w:p>
+        </w:tc>
+        <w:tc>
+          <w:tcPr>
+            <w:shd w:fill="auto" w:val="clear"/>
+            <w:tcMar>
+              <w:top w:w="100.0" w:type="dxa"/>
+              <w:left w:w="100.0" w:type="dxa"/>
+              <w:bottom w:w="100.0" w:type="dxa"/>
+              <w:right w:w="100.0" w:type="dxa"/>
+            </w:tcMar>
+            <w:vAlign w:val="top"/>
+          </w:tcPr>
+          <w:p>
+            <w:pPr>
+              <w:keepNext w:val="0"/>
+              <w:keepLines w:val="0"/>
+              <w:pageBreakBefore w:val="0"/>
+              <w:widowControl w:val="0"/>
+              <w:pBdr>
+                <w:top w:space="0" w:sz="0" w:val="nil"/>
+                <w:left w:space="0" w:sz="0" w:val="nil"/>
+                <w:bottom w:space="0" w:sz="0" w:val="nil"/>
+                <w:right w:space="0" w:sz="0" w:val="nil"/>
+                <w:between w:space="0" w:sz="0" w:val="nil"/>
+              </w:pBdr>
+              <w:shd w:fill="auto" w:val="clear"/>
+              <w:spacing w:after="0" w:before="0" w:line="240" w:lineRule="auto"/>
+              <w:ind w:left="0" w:right="0" w:firstLine="0"/>
+              <w:jc w:val="left"/>
+              <w:rPr/>
+            </w:pPr>
+            <w:r>
+              <w:rPr>
+                <w:rtl w:val="0"/>
+              </w:rPr>
+              <w:t xml:space="preserve">Serial</w:t>
+            </w:r>
+          </w:p>
+        </w:tc>
+        <w:tc>
+          <w:tcPr>
+            <w:shd w:fill="auto" w:val="clear"/>
+            <w:tcMar>
+              <w:top w:w="100.0" w:type="dxa"/>
+              <w:left w:w="100.0" w:type="dxa"/>
+              <w:bottom w:w="100.0" w:type="dxa"/>
+              <w:right w:w="100.0" w:type="dxa"/>
+            </w:tcMar>
+            <w:vAlign w:val="top"/>
+          </w:tcPr>
+          <w:p>
+            <w:pPr>
+              <w:keepNext w:val="0"/>
+              <w:keepLines w:val="0"/>
+              <w:pageBreakBefore w:val="0"/>
+              <w:widowControl w:val="0"/>
+              <w:pBdr>
+                <w:top w:space="0" w:sz="0" w:val="nil"/>
+                <w:left w:space="0" w:sz="0" w:val="nil"/>
+                <w:bottom w:space="0" w:sz="0" w:val="nil"/>
+                <w:right w:space="0" w:sz="0" w:val="nil"/>
+                <w:between w:space="0" w:sz="0" w:val="nil"/>
+              </w:pBdr>
+              <w:shd w:fill="auto" w:val="clear"/>
+              <w:spacing w:after="0" w:before="0" w:line="240" w:lineRule="auto"/>
+              <w:ind w:left="0" w:right="0" w:firstLine="0"/>
+              <w:jc w:val="left"/>
+              <w:rPr/>
+            </w:pPr>
+            <w:r>
+              <w:rPr>
+                <w:rtl w:val="0"/>
+              </w:rPr>
+              <w:t xml:space="preserve">PK</w:t>
+            </w:r>
+          </w:p>
+        </w:tc>
+      </w:tr>
+      <w:tr>
+        <w:trPr>
+          <w:cantSplit w:val="0"/>
+          <w:trHeight w:val="585" w:hRule="atLeast"/>
+          <w:tblHeader w:val="0"/>
+        </w:trPr>
+        <w:tc>
+          <w:tcPr>
+            <w:vMerge w:val="continue"/>
+            <w:shd w:fill="auto" w:val="clear"/>
+            <w:tcMar>
+              <w:top w:w="100.0" w:type="dxa"/>
+              <w:left w:w="100.0" w:type="dxa"/>
+              <w:bottom w:w="100.0" w:type="dxa"/>
+              <w:right w:w="100.0" w:type="dxa"/>
+            </w:tcMar>
+            <w:vAlign w:val="top"/>
+          </w:tcPr>
+          <w:p>
+            <w:pPr>
+              <w:keepNext w:val="0"/>
+              <w:keepLines w:val="0"/>
+              <w:pageBreakBefore w:val="0"/>
+              <w:widowControl w:val="0"/>
+              <w:pBdr>
+                <w:top w:space="0" w:sz="0" w:val="nil"/>
+                <w:left w:space="0" w:sz="0" w:val="nil"/>
+                <w:bottom w:space="0" w:sz="0" w:val="nil"/>
+                <w:right w:space="0" w:sz="0" w:val="nil"/>
+                <w:between w:space="0" w:sz="0" w:val="nil"/>
+              </w:pBdr>
+              <w:shd w:fill="auto" w:val="clear"/>
+              <w:spacing w:after="0" w:before="0" w:line="240" w:lineRule="auto"/>
+              <w:ind w:left="0" w:right="0" w:firstLine="0"/>
+              <w:jc w:val="left"/>
+              <w:rPr/>
+            </w:pPr>
+            <w:r>
+              <w:rPr>
+                <w:rtl w:val="0"/>
+              </w:rPr>
+            </w:r>
+          </w:p>
+        </w:tc>
+        <w:tc>
+          <w:tcPr>
+            <w:shd w:fill="auto" w:val="clear"/>
+            <w:tcMar>
+              <w:top w:w="100.0" w:type="dxa"/>
+              <w:left w:w="100.0" w:type="dxa"/>
+              <w:bottom w:w="100.0" w:type="dxa"/>
+              <w:right w:w="100.0" w:type="dxa"/>
+            </w:tcMar>
+            <w:vAlign w:val="top"/>
+          </w:tcPr>
+          <w:p>
+            <w:pPr>
+              <w:keepNext w:val="0"/>
+              <w:keepLines w:val="0"/>
+              <w:pageBreakBefore w:val="0"/>
+              <w:widowControl w:val="0"/>
+              <w:pBdr>
+                <w:top w:space="0" w:sz="0" w:val="nil"/>
+                <w:left w:space="0" w:sz="0" w:val="nil"/>
+                <w:bottom w:space="0" w:sz="0" w:val="nil"/>
+                <w:right w:space="0" w:sz="0" w:val="nil"/>
+                <w:between w:space="0" w:sz="0" w:val="nil"/>
+              </w:pBdr>
+              <w:shd w:fill="auto" w:val="clear"/>
+              <w:spacing w:after="0" w:before="0" w:line="240" w:lineRule="auto"/>
+              <w:ind w:left="0" w:right="0" w:firstLine="0"/>
+              <w:jc w:val="left"/>
+              <w:rPr/>
+            </w:pPr>
+            <w:r>
+              <w:rPr>
+                <w:rtl w:val="0"/>
+              </w:rPr>
+              <w:t xml:space="preserve">nombre</w:t>
+            </w:r>
+          </w:p>
+        </w:tc>
+        <w:tc>
+          <w:tcPr>
+            <w:shd w:fill="auto" w:val="clear"/>
+            <w:tcMar>
+              <w:top w:w="100.0" w:type="dxa"/>
+              <w:left w:w="100.0" w:type="dxa"/>
+              <w:bottom w:w="100.0" w:type="dxa"/>
+              <w:right w:w="100.0" w:type="dxa"/>
+            </w:tcMar>
+            <w:vAlign w:val="top"/>
+          </w:tcPr>
+          <w:p>
+            <w:pPr>
+              <w:keepNext w:val="0"/>
+              <w:keepLines w:val="0"/>
+              <w:pageBreakBefore w:val="0"/>
+              <w:widowControl w:val="0"/>
+              <w:pBdr>
+                <w:top w:space="0" w:sz="0" w:val="nil"/>
+                <w:left w:space="0" w:sz="0" w:val="nil"/>
+                <w:bottom w:space="0" w:sz="0" w:val="nil"/>
+                <w:right w:space="0" w:sz="0" w:val="nil"/>
+                <w:between w:space="0" w:sz="0" w:val="nil"/>
+              </w:pBdr>
+              <w:shd w:fill="auto" w:val="clear"/>
+              <w:spacing w:after="0" w:before="0" w:line="240" w:lineRule="auto"/>
+              <w:ind w:left="0" w:right="0" w:firstLine="0"/>
+              <w:jc w:val="left"/>
+              <w:rPr/>
+            </w:pPr>
+            <w:r>
+              <w:rPr>
+                <w:rtl w:val="0"/>
+              </w:rPr>
+              <w:t xml:space="preserve">varchar(50)</w:t>
+            </w:r>
+          </w:p>
+        </w:tc>
+        <w:tc>
+          <w:tcPr>
+            <w:shd w:fill="auto" w:val="clear"/>
+            <w:tcMar>
+              <w:top w:w="100.0" w:type="dxa"/>
+              <w:left w:w="100.0" w:type="dxa"/>
+              <w:bottom w:w="100.0" w:type="dxa"/>
+              <w:right w:w="100.0" w:type="dxa"/>
+            </w:tcMar>
+            <w:vAlign w:val="top"/>
+          </w:tcPr>
+          <w:p>
+            <w:pPr>
+              <w:keepNext w:val="0"/>
+              <w:keepLines w:val="0"/>
+              <w:pageBreakBefore w:val="0"/>
+              <w:widowControl w:val="0"/>
+              <w:pBdr>
+                <w:top w:space="0" w:sz="0" w:val="nil"/>
+                <w:left w:space="0" w:sz="0" w:val="nil"/>
+                <w:bottom w:space="0" w:sz="0" w:val="nil"/>
+                <w:right w:space="0" w:sz="0" w:val="nil"/>
+                <w:between w:space="0" w:sz="0" w:val="nil"/>
+              </w:pBdr>
+              <w:shd w:fill="auto" w:val="clear"/>
+              <w:spacing w:after="0" w:before="0" w:line="240" w:lineRule="auto"/>
+              <w:ind w:left="0" w:right="0" w:firstLine="0"/>
+              <w:jc w:val="left"/>
+              <w:rPr/>
+            </w:pPr>
+            <w:r>
+              <w:rPr>
+                <w:rtl w:val="0"/>
+              </w:rPr>
+              <w:t xml:space="preserve">NOT NULL</w:t>
+            </w:r>
+          </w:p>
+        </w:tc>
+      </w:tr>
+      <w:tr>
+        <w:trPr>
+          <w:cantSplit w:val="0"/>
+          <w:trHeight w:val="585" w:hRule="atLeast"/>
+          <w:tblHeader w:val="0"/>
+        </w:trPr>
+        <w:tc>
+          <w:tcPr>
+            <w:vMerge w:val="continue"/>
+            <w:shd w:fill="auto" w:val="clear"/>
+            <w:tcMar>
+              <w:top w:w="100.0" w:type="dxa"/>
+              <w:left w:w="100.0" w:type="dxa"/>
+              <w:bottom w:w="100.0" w:type="dxa"/>
+              <w:right w:w="100.0" w:type="dxa"/>
+            </w:tcMar>
+            <w:vAlign w:val="top"/>
+          </w:tcPr>
+          <w:p>
+            <w:pPr>
+              <w:keepNext w:val="0"/>
+              <w:keepLines w:val="0"/>
+              <w:pageBreakBefore w:val="0"/>
+              <w:widowControl w:val="0"/>
+              <w:pBdr>
+                <w:top w:space="0" w:sz="0" w:val="nil"/>
+                <w:left w:space="0" w:sz="0" w:val="nil"/>
+                <w:bottom w:space="0" w:sz="0" w:val="nil"/>
+                <w:right w:space="0" w:sz="0" w:val="nil"/>
+                <w:between w:space="0" w:sz="0" w:val="nil"/>
+              </w:pBdr>
+              <w:shd w:fill="auto" w:val="clear"/>
+              <w:spacing w:after="0" w:before="0" w:line="240" w:lineRule="auto"/>
+              <w:ind w:left="0" w:right="0" w:firstLine="0"/>
+              <w:jc w:val="left"/>
+              <w:rPr/>
+            </w:pPr>
+            <w:r>
+              <w:rPr>
+                <w:rtl w:val="0"/>
+              </w:rPr>
+            </w:r>
+          </w:p>
+        </w:tc>
+        <w:tc>
+          <w:tcPr>
+            <w:shd w:fill="auto" w:val="clear"/>
+            <w:tcMar>
+              <w:top w:w="100.0" w:type="dxa"/>
+              <w:left w:w="100.0" w:type="dxa"/>
+              <w:bottom w:w="100.0" w:type="dxa"/>
+              <w:right w:w="100.0" w:type="dxa"/>
+            </w:tcMar>
+            <w:vAlign w:val="top"/>
+          </w:tcPr>
+          <w:p>
+            <w:pPr>
+              <w:keepNext w:val="0"/>
+              <w:keepLines w:val="0"/>
+              <w:pageBreakBefore w:val="0"/>
+              <w:widowControl w:val="0"/>
+              <w:pBdr>
+                <w:top w:space="0" w:sz="0" w:val="nil"/>
+                <w:left w:space="0" w:sz="0" w:val="nil"/>
+                <w:bottom w:space="0" w:sz="0" w:val="nil"/>
+                <w:right w:space="0" w:sz="0" w:val="nil"/>
+                <w:between w:space="0" w:sz="0" w:val="nil"/>
+              </w:pBdr>
+              <w:shd w:fill="auto" w:val="clear"/>
+              <w:spacing w:after="0" w:before="0" w:line="240" w:lineRule="auto"/>
+              <w:ind w:left="0" w:right="0" w:firstLine="0"/>
+              <w:jc w:val="left"/>
+              <w:rPr/>
+            </w:pPr>
+            <w:r>
+              <w:rPr>
+                <w:rtl w:val="0"/>
+              </w:rPr>
+              <w:t xml:space="preserve">ciudad</w:t>
+            </w:r>
+          </w:p>
+        </w:tc>
+        <w:tc>
+          <w:tcPr>
+            <w:shd w:fill="auto" w:val="clear"/>
+            <w:tcMar>
+              <w:top w:w="100.0" w:type="dxa"/>
+              <w:left w:w="100.0" w:type="dxa"/>
+              <w:bottom w:w="100.0" w:type="dxa"/>
+              <w:right w:w="100.0" w:type="dxa"/>
+            </w:tcMar>
+            <w:vAlign w:val="top"/>
+          </w:tcPr>
+          <w:p>
+            <w:pPr>
+              <w:keepNext w:val="0"/>
+              <w:keepLines w:val="0"/>
+              <w:pageBreakBefore w:val="0"/>
+              <w:widowControl w:val="0"/>
+              <w:pBdr>
+                <w:top w:space="0" w:sz="0" w:val="nil"/>
+                <w:left w:space="0" w:sz="0" w:val="nil"/>
+                <w:bottom w:space="0" w:sz="0" w:val="nil"/>
+                <w:right w:space="0" w:sz="0" w:val="nil"/>
+                <w:between w:space="0" w:sz="0" w:val="nil"/>
+              </w:pBdr>
+              <w:shd w:fill="auto" w:val="clear"/>
+              <w:spacing w:after="0" w:before="0" w:line="240" w:lineRule="auto"/>
+              <w:ind w:left="0" w:right="0" w:firstLine="0"/>
+              <w:jc w:val="left"/>
+              <w:rPr/>
+            </w:pPr>
+            <w:r>
+              <w:rPr>
+                <w:rtl w:val="0"/>
+              </w:rPr>
+              <w:t xml:space="preserve">varchar(50)</w:t>
+            </w:r>
+          </w:p>
+        </w:tc>
+        <w:tc>
+          <w:tcPr>
+            <w:shd w:fill="auto" w:val="clear"/>
+            <w:tcMar>
+              <w:top w:w="100.0" w:type="dxa"/>
+              <w:left w:w="100.0" w:type="dxa"/>
+              <w:bottom w:w="100.0" w:type="dxa"/>
+              <w:right w:w="100.0" w:type="dxa"/>
+            </w:tcMar>
+            <w:vAlign w:val="top"/>
+          </w:tcPr>
+          <w:p>
+            <w:pPr>
+              <w:keepNext w:val="0"/>
+              <w:keepLines w:val="0"/>
+              <w:pageBreakBefore w:val="0"/>
+              <w:widowControl w:val="0"/>
+              <w:pBdr>
+                <w:top w:space="0" w:sz="0" w:val="nil"/>
+                <w:left w:space="0" w:sz="0" w:val="nil"/>
+                <w:bottom w:space="0" w:sz="0" w:val="nil"/>
+                <w:right w:space="0" w:sz="0" w:val="nil"/>
+                <w:between w:space="0" w:sz="0" w:val="nil"/>
+              </w:pBdr>
+              <w:shd w:fill="auto" w:val="clear"/>
+              <w:spacing w:after="0" w:before="0" w:line="240" w:lineRule="auto"/>
+              <w:ind w:left="0" w:right="0" w:firstLine="0"/>
+              <w:jc w:val="left"/>
+              <w:rPr/>
+            </w:pPr>
+            <w:r>
+              <w:rPr>
+                <w:rtl w:val="0"/>
+              </w:rPr>
+              <w:t xml:space="preserve">NOT NULL</w:t>
+            </w:r>
+          </w:p>
+        </w:tc>
+      </w:tr>
+      <w:tr>
+        <w:trPr>
+          <w:cantSplit w:val="0"/>
+          <w:trHeight w:val="585" w:hRule="atLeast"/>
+          <w:tblHeader w:val="0"/>
+        </w:trPr>
+        <w:tc>
+          <w:tcPr>
+            <w:vMerge w:val="continue"/>
+            <w:shd w:fill="auto" w:val="clear"/>
+            <w:tcMar>
+              <w:top w:w="100.0" w:type="dxa"/>
+              <w:left w:w="100.0" w:type="dxa"/>
+              <w:bottom w:w="100.0" w:type="dxa"/>
+              <w:right w:w="100.0" w:type="dxa"/>
+            </w:tcMar>
+            <w:vAlign w:val="top"/>
+          </w:tcPr>
+          <w:p>
+            <w:pPr>
+              <w:keepNext w:val="0"/>
+              <w:keepLines w:val="0"/>
+              <w:pageBreakBefore w:val="0"/>
+              <w:widowControl w:val="0"/>
+              <w:pBdr>
+                <w:top w:space="0" w:sz="0" w:val="nil"/>
+                <w:left w:space="0" w:sz="0" w:val="nil"/>
+                <w:bottom w:space="0" w:sz="0" w:val="nil"/>
+                <w:right w:space="0" w:sz="0" w:val="nil"/>
+                <w:between w:space="0" w:sz="0" w:val="nil"/>
+              </w:pBdr>
+              <w:shd w:fill="auto" w:val="clear"/>
+              <w:spacing w:after="0" w:before="0" w:line="240" w:lineRule="auto"/>
+              <w:ind w:left="0" w:right="0" w:firstLine="0"/>
+              <w:jc w:val="left"/>
+              <w:rPr/>
+            </w:pPr>
+            <w:r>
+              <w:rPr>
+                <w:rtl w:val="0"/>
+              </w:rPr>
+            </w:r>
+          </w:p>
+        </w:tc>
+        <w:tc>
+          <w:tcPr>
+            <w:shd w:fill="auto" w:val="clear"/>
+            <w:tcMar>
+              <w:top w:w="100.0" w:type="dxa"/>
+              <w:left w:w="100.0" w:type="dxa"/>
+              <w:bottom w:w="100.0" w:type="dxa"/>
+              <w:right w:w="100.0" w:type="dxa"/>
+            </w:tcMar>
+            <w:vAlign w:val="top"/>
+          </w:tcPr>
+          <w:p>
+            <w:pPr>
+              <w:keepNext w:val="0"/>
+              <w:keepLines w:val="0"/>
+              <w:pageBreakBefore w:val="0"/>
+              <w:widowControl w:val="0"/>
+              <w:pBdr>
+                <w:top w:space="0" w:sz="0" w:val="nil"/>
+                <w:left w:space="0" w:sz="0" w:val="nil"/>
+                <w:bottom w:space="0" w:sz="0" w:val="nil"/>
+                <w:right w:space="0" w:sz="0" w:val="nil"/>
+                <w:between w:space="0" w:sz="0" w:val="nil"/>
+              </w:pBdr>
+              <w:shd w:fill="auto" w:val="clear"/>
+              <w:spacing w:after="0" w:before="0" w:line="240" w:lineRule="auto"/>
+              <w:ind w:left="0" w:right="0" w:firstLine="0"/>
+              <w:jc w:val="left"/>
+              <w:rPr/>
+            </w:pPr>
+            <w:r>
+              <w:rPr>
+                <w:rtl w:val="0"/>
+              </w:rPr>
+              <w:t xml:space="preserve">capacidad</w:t>
+            </w:r>
+          </w:p>
+        </w:tc>
+        <w:tc>
+          <w:tcPr>
+            <w:shd w:fill="auto" w:val="clear"/>
+            <w:tcMar>
+              <w:top w:w="100.0" w:type="dxa"/>
+              <w:left w:w="100.0" w:type="dxa"/>
+              <w:bottom w:w="100.0" w:type="dxa"/>
+              <w:right w:w="100.0" w:type="dxa"/>
+            </w:tcMar>
+            <w:vAlign w:val="top"/>
+          </w:tcPr>
+          <w:p>
+            <w:pPr>
+              <w:keepNext w:val="0"/>
+              <w:keepLines w:val="0"/>
+              <w:pageBreakBefore w:val="0"/>
+              <w:widowControl w:val="0"/>
+              <w:pBdr>
+                <w:top w:space="0" w:sz="0" w:val="nil"/>
+                <w:left w:space="0" w:sz="0" w:val="nil"/>
+                <w:bottom w:space="0" w:sz="0" w:val="nil"/>
+                <w:right w:space="0" w:sz="0" w:val="nil"/>
+                <w:between w:space="0" w:sz="0" w:val="nil"/>
+              </w:pBdr>
+              <w:shd w:fill="auto" w:val="clear"/>
+              <w:spacing w:after="0" w:before="0" w:line="240" w:lineRule="auto"/>
+              <w:ind w:left="0" w:right="0" w:firstLine="0"/>
+              <w:jc w:val="left"/>
+              <w:rPr/>
+            </w:pPr>
+            <w:r>
+              <w:rPr>
+                <w:rtl w:val="0"/>
+              </w:rPr>
+              <w:t xml:space="preserve">int</w:t>
+            </w:r>
+          </w:p>
+        </w:tc>
+        <w:tc>
+          <w:tcPr>
+            <w:shd w:fill="auto" w:val="clear"/>
+            <w:tcMar>
+              <w:top w:w="100.0" w:type="dxa"/>
+              <w:left w:w="100.0" w:type="dxa"/>
+              <w:bottom w:w="100.0" w:type="dxa"/>
+              <w:right w:w="100.0" w:type="dxa"/>
+            </w:tcMar>
+            <w:vAlign w:val="top"/>
+          </w:tcPr>
+          <w:p>
+            <w:pPr>
+              <w:keepNext w:val="0"/>
+              <w:keepLines w:val="0"/>
+              <w:pageBreakBefore w:val="0"/>
+              <w:widowControl w:val="0"/>
+              <w:pBdr>
+                <w:top w:space="0" w:sz="0" w:val="nil"/>
+                <w:left w:space="0" w:sz="0" w:val="nil"/>
+                <w:bottom w:space="0" w:sz="0" w:val="nil"/>
+                <w:right w:space="0" w:sz="0" w:val="nil"/>
+                <w:between w:space="0" w:sz="0" w:val="nil"/>
+              </w:pBdr>
+              <w:shd w:fill="auto" w:val="clear"/>
+              <w:spacing w:after="0" w:before="0" w:line="240" w:lineRule="auto"/>
+              <w:ind w:left="0" w:right="0" w:firstLine="0"/>
+              <w:jc w:val="left"/>
+              <w:rPr/>
+            </w:pPr>
+            <w:r>
+              <w:rPr>
+                <w:rtl w:val="0"/>
+              </w:rPr>
+              <w:t xml:space="preserve">NOT NULL</w:t>
+            </w:r>
+          </w:p>
+          <w:p>
+            <w:pPr>
+              <w:keepNext w:val="0"/>
+              <w:keepLines w:val="0"/>
+              <w:pageBreakBefore w:val="0"/>
+              <w:widowControl w:val="0"/>
+              <w:pBdr>
+                <w:top w:space="0" w:sz="0" w:val="nil"/>
+                <w:left w:space="0" w:sz="0" w:val="nil"/>
+                <w:bottom w:space="0" w:sz="0" w:val="nil"/>
+                <w:right w:space="0" w:sz="0" w:val="nil"/>
+                <w:between w:space="0" w:sz="0" w:val="nil"/>
+              </w:pBdr>
+              <w:shd w:fill="auto" w:val="clear"/>
+              <w:spacing w:after="0" w:before="0" w:line="240" w:lineRule="auto"/>
+              <w:ind w:left="0" w:right="0" w:firstLine="0"/>
+              <w:jc w:val="left"/>
+              <w:rPr/>
+            </w:pPr>
+            <w:r>
+              <w:rPr>
+                <w:rtl w:val="0"/>
+              </w:rPr>
+              <w:t xml:space="preserve">CHECK (capacidad &gt;0)</w:t>
+            </w:r>
+          </w:p>
+        </w:tc>
+      </w:tr>
+      <w:tr>
+        <w:trPr>
+          <w:cantSplit w:val="0"/>
+          <w:trHeight w:val="585" w:hRule="atLeast"/>
+          <w:tblHeader w:val="0"/>
+        </w:trPr>
+        <w:tc>
+          <w:tcPr>
+            <w:vMerge w:val="continue"/>
+            <w:shd w:fill="auto" w:val="clear"/>
+            <w:tcMar>
+              <w:top w:w="100.0" w:type="dxa"/>
+              <w:left w:w="100.0" w:type="dxa"/>
+              <w:bottom w:w="100.0" w:type="dxa"/>
+              <w:right w:w="100.0" w:type="dxa"/>
+            </w:tcMar>
+            <w:vAlign w:val="top"/>
+          </w:tcPr>
+          <w:p>
+            <w:pPr>
+              <w:keepNext w:val="0"/>
+              <w:keepLines w:val="0"/>
+              <w:pageBreakBefore w:val="0"/>
+              <w:widowControl w:val="0"/>
+              <w:pBdr>
+                <w:top w:space="0" w:sz="0" w:val="nil"/>
+                <w:left w:space="0" w:sz="0" w:val="nil"/>
+                <w:bottom w:space="0" w:sz="0" w:val="nil"/>
+                <w:right w:space="0" w:sz="0" w:val="nil"/>
+                <w:between w:space="0" w:sz="0" w:val="nil"/>
+              </w:pBdr>
+              <w:shd w:fill="auto" w:val="clear"/>
+              <w:spacing w:after="0" w:before="0" w:line="240" w:lineRule="auto"/>
+              <w:ind w:left="0" w:right="0" w:firstLine="0"/>
+              <w:jc w:val="left"/>
+              <w:rPr/>
+            </w:pPr>
+            <w:r>
+              <w:rPr>
+                <w:rtl w:val="0"/>
+              </w:rPr>
+            </w:r>
+          </w:p>
+        </w:tc>
+        <w:tc>
+          <w:tcPr>
+            <w:shd w:fill="auto" w:val="clear"/>
+            <w:tcMar>
+              <w:top w:w="100.0" w:type="dxa"/>
+              <w:left w:w="100.0" w:type="dxa"/>
+              <w:bottom w:w="100.0" w:type="dxa"/>
+              <w:right w:w="100.0" w:type="dxa"/>
+            </w:tcMar>
+            <w:vAlign w:val="top"/>
+          </w:tcPr>
+          <w:p>
+            <w:pPr>
+              <w:keepNext w:val="0"/>
+              <w:keepLines w:val="0"/>
+              <w:pageBreakBefore w:val="0"/>
+              <w:widowControl w:val="0"/>
+              <w:pBdr>
+                <w:top w:space="0" w:sz="0" w:val="nil"/>
+                <w:left w:space="0" w:sz="0" w:val="nil"/>
+                <w:bottom w:space="0" w:sz="0" w:val="nil"/>
+                <w:right w:space="0" w:sz="0" w:val="nil"/>
+                <w:between w:space="0" w:sz="0" w:val="nil"/>
+              </w:pBdr>
+              <w:shd w:fill="auto" w:val="clear"/>
+              <w:spacing w:after="0" w:before="0" w:line="240" w:lineRule="auto"/>
+              <w:ind w:left="0" w:right="0" w:firstLine="0"/>
+              <w:jc w:val="left"/>
+              <w:rPr/>
+            </w:pPr>
+            <w:r>
+              <w:rPr>
+                <w:rtl w:val="0"/>
+              </w:rPr>
+              <w:t xml:space="preserve">direccion</w:t>
+            </w:r>
+          </w:p>
+        </w:tc>
+        <w:tc>
+          <w:tcPr>
+            <w:shd w:fill="auto" w:val="clear"/>
+            <w:tcMar>
+              <w:top w:w="100.0" w:type="dxa"/>
+              <w:left w:w="100.0" w:type="dxa"/>
+              <w:bottom w:w="100.0" w:type="dxa"/>
+              <w:right w:w="100.0" w:type="dxa"/>
+            </w:tcMar>
+            <w:vAlign w:val="top"/>
+          </w:tcPr>
+          <w:p>
+            <w:pPr>
+              <w:keepNext w:val="0"/>
+              <w:keepLines w:val="0"/>
+              <w:pageBreakBefore w:val="0"/>
+              <w:widowControl w:val="0"/>
+              <w:pBdr>
+                <w:top w:space="0" w:sz="0" w:val="nil"/>
+                <w:left w:space="0" w:sz="0" w:val="nil"/>
+                <w:bottom w:space="0" w:sz="0" w:val="nil"/>
+                <w:right w:space="0" w:sz="0" w:val="nil"/>
+                <w:between w:space="0" w:sz="0" w:val="nil"/>
+              </w:pBdr>
+              <w:shd w:fill="auto" w:val="clear"/>
+              <w:spacing w:after="0" w:before="0" w:line="240" w:lineRule="auto"/>
+              <w:ind w:left="0" w:right="0" w:firstLine="0"/>
+              <w:jc w:val="left"/>
+              <w:rPr/>
+            </w:pPr>
+            <w:r>
+              <w:rPr>
+                <w:rtl w:val="0"/>
+              </w:rPr>
+              <w:t xml:space="preserve">varchar(200)</w:t>
+            </w:r>
+          </w:p>
+        </w:tc>
+        <w:tc>
+          <w:tcPr>
+            <w:shd w:fill="auto" w:val="clear"/>
+            <w:tcMar>
+              <w:top w:w="100.0" w:type="dxa"/>
+              <w:left w:w="100.0" w:type="dxa"/>
+              <w:bottom w:w="100.0" w:type="dxa"/>
+              <w:right w:w="100.0" w:type="dxa"/>
+            </w:tcMar>
+            <w:vAlign w:val="top"/>
+          </w:tcPr>
+          <w:p>
+            <w:pPr>
+              <w:keepNext w:val="0"/>
+              <w:keepLines w:val="0"/>
+              <w:pageBreakBefore w:val="0"/>
+              <w:widowControl w:val="0"/>
+              <w:pBdr>
+                <w:top w:space="0" w:sz="0" w:val="nil"/>
+                <w:left w:space="0" w:sz="0" w:val="nil"/>
+                <w:bottom w:space="0" w:sz="0" w:val="nil"/>
+                <w:right w:space="0" w:sz="0" w:val="nil"/>
+                <w:between w:space="0" w:sz="0" w:val="nil"/>
+              </w:pBdr>
+              <w:shd w:fill="auto" w:val="clear"/>
+              <w:spacing w:after="0" w:before="0" w:line="240" w:lineRule="auto"/>
+              <w:ind w:left="0" w:right="0" w:firstLine="0"/>
+              <w:jc w:val="left"/>
+              <w:rPr/>
+            </w:pPr>
+            <w:r>
+              <w:rPr>
+                <w:rtl w:val="0"/>
+              </w:rPr>
+              <w:t xml:space="preserve">NOT NULL</w:t>
+            </w:r>
+          </w:p>
+        </w:tc>
+      </w:tr>
+    </w:tbl>
+    <w:p>
+      <w:pPr>
+        <w:rPr/>
+      </w:pPr>
+      <w:r>
+        <w:rPr>
+          <w:rtl w:val="0"/>
+        </w:rPr>
+      </w:r>
+    </w:p>
+    <w:p>
+      <w:pPr>
         <w:rPr/>
       </w:pPr>
       <w:r>
@@ -1134,17 +2177,1268 @@
         <w:rPr/>
       </w:pPr>
       <w:r>
-        <w:br w:type="page"/>
-      </w:r>
-      <w:r>
-        <w:rPr>
-          <w:rtl w:val="0"/>
-        </w:rPr>
-      </w:r>
-    </w:p>
-    <w:p>
-      <w:pPr>
-        <w:ind w:left="0" w:firstLine="0"/>
+        <w:rPr>
+          <w:rtl w:val="0"/>
+        </w:rPr>
+        <w:t xml:space="preserve">Modificación a tabla eventos</w:t>
+      </w:r>
+    </w:p>
+    <w:p>
+      <w:pPr>
+        <w:rPr/>
+      </w:pPr>
+      <w:r>
+        <w:rPr>
+          <w:rtl w:val="0"/>
+        </w:rPr>
+      </w:r>
+    </w:p>
+    <w:tbl>
+      <w:tblPr>
+        <w:tblStyle w:val="Table2"/>
+        <w:tblW w:w="8940.0" w:type="dxa"/>
+        <w:jc w:val="left"/>
+        <w:tblBorders>
+          <w:top w:color="000000" w:space="0" w:sz="8" w:val="single"/>
+          <w:left w:color="000000" w:space="0" w:sz="8" w:val="single"/>
+          <w:bottom w:color="000000" w:space="0" w:sz="8" w:val="single"/>
+          <w:right w:color="000000" w:space="0" w:sz="8" w:val="single"/>
+          <w:insideH w:color="000000" w:space="0" w:sz="8" w:val="single"/>
+          <w:insideV w:color="000000" w:space="0" w:sz="8" w:val="single"/>
+        </w:tblBorders>
+        <w:tblLayout w:type="fixed"/>
+        <w:tblLook w:val="0600"/>
+      </w:tblPr>
+      <w:tblGrid>
+        <w:gridCol w:w="1830"/>
+        <w:gridCol w:w="2565"/>
+        <w:gridCol w:w="1860"/>
+        <w:gridCol w:w="2685"/>
+        <w:tblGridChange w:id="0">
+          <w:tblGrid>
+            <w:gridCol w:w="1830"/>
+            <w:gridCol w:w="2565"/>
+            <w:gridCol w:w="1860"/>
+            <w:gridCol w:w="2685"/>
+          </w:tblGrid>
+        </w:tblGridChange>
+      </w:tblGrid>
+      <w:tr>
+        <w:trPr>
+          <w:cantSplit w:val="0"/>
+          <w:trHeight w:val="477.978515625" w:hRule="atLeast"/>
+          <w:tblHeader w:val="0"/>
+        </w:trPr>
+        <w:tc>
+          <w:tcPr>
+            <w:shd w:fill="auto" w:val="clear"/>
+            <w:tcMar>
+              <w:top w:w="100.0" w:type="dxa"/>
+              <w:left w:w="100.0" w:type="dxa"/>
+              <w:bottom w:w="100.0" w:type="dxa"/>
+              <w:right w:w="100.0" w:type="dxa"/>
+            </w:tcMar>
+            <w:vAlign w:val="top"/>
+          </w:tcPr>
+          <w:p>
+            <w:pPr>
+              <w:widowControl w:val="0"/>
+              <w:spacing w:line="240" w:lineRule="auto"/>
+              <w:rPr/>
+            </w:pPr>
+            <w:r>
+              <w:rPr>
+                <w:rtl w:val="0"/>
+              </w:rPr>
+              <w:t xml:space="preserve">Tabla</w:t>
+            </w:r>
+          </w:p>
+        </w:tc>
+        <w:tc>
+          <w:tcPr>
+            <w:shd w:fill="auto" w:val="clear"/>
+            <w:tcMar>
+              <w:top w:w="100.0" w:type="dxa"/>
+              <w:left w:w="100.0" w:type="dxa"/>
+              <w:bottom w:w="100.0" w:type="dxa"/>
+              <w:right w:w="100.0" w:type="dxa"/>
+            </w:tcMar>
+            <w:vAlign w:val="top"/>
+          </w:tcPr>
+          <w:p>
+            <w:pPr>
+              <w:widowControl w:val="0"/>
+              <w:spacing w:line="240" w:lineRule="auto"/>
+              <w:rPr/>
+            </w:pPr>
+            <w:r>
+              <w:rPr>
+                <w:rtl w:val="0"/>
+              </w:rPr>
+              <w:t xml:space="preserve">Columna</w:t>
+            </w:r>
+          </w:p>
+        </w:tc>
+        <w:tc>
+          <w:tcPr>
+            <w:shd w:fill="auto" w:val="clear"/>
+            <w:tcMar>
+              <w:top w:w="100.0" w:type="dxa"/>
+              <w:left w:w="100.0" w:type="dxa"/>
+              <w:bottom w:w="100.0" w:type="dxa"/>
+              <w:right w:w="100.0" w:type="dxa"/>
+            </w:tcMar>
+            <w:vAlign w:val="top"/>
+          </w:tcPr>
+          <w:p>
+            <w:pPr>
+              <w:widowControl w:val="0"/>
+              <w:spacing w:line="240" w:lineRule="auto"/>
+              <w:rPr/>
+            </w:pPr>
+            <w:r>
+              <w:rPr>
+                <w:rtl w:val="0"/>
+              </w:rPr>
+              <w:t xml:space="preserve">Tipo de dato</w:t>
+            </w:r>
+          </w:p>
+        </w:tc>
+        <w:tc>
+          <w:tcPr>
+            <w:shd w:fill="auto" w:val="clear"/>
+            <w:tcMar>
+              <w:top w:w="100.0" w:type="dxa"/>
+              <w:left w:w="100.0" w:type="dxa"/>
+              <w:bottom w:w="100.0" w:type="dxa"/>
+              <w:right w:w="100.0" w:type="dxa"/>
+            </w:tcMar>
+            <w:vAlign w:val="top"/>
+          </w:tcPr>
+          <w:p>
+            <w:pPr>
+              <w:widowControl w:val="0"/>
+              <w:spacing w:line="240" w:lineRule="auto"/>
+              <w:rPr/>
+            </w:pPr>
+            <w:r>
+              <w:rPr>
+                <w:rtl w:val="0"/>
+              </w:rPr>
+              <w:t xml:space="preserve">Constraints</w:t>
+            </w:r>
+          </w:p>
+        </w:tc>
+      </w:tr>
+      <w:tr>
+        <w:trPr>
+          <w:cantSplit w:val="0"/>
+          <w:trHeight w:val="585" w:hRule="atLeast"/>
+          <w:tblHeader w:val="0"/>
+        </w:trPr>
+        <w:tc>
+          <w:tcPr>
+            <w:vMerge w:val="restart"/>
+            <w:shd w:fill="auto" w:val="clear"/>
+            <w:tcMar>
+              <w:top w:w="100.0" w:type="dxa"/>
+              <w:left w:w="100.0" w:type="dxa"/>
+              <w:bottom w:w="100.0" w:type="dxa"/>
+              <w:right w:w="100.0" w:type="dxa"/>
+            </w:tcMar>
+            <w:vAlign w:val="top"/>
+          </w:tcPr>
+          <w:p>
+            <w:pPr>
+              <w:widowControl w:val="0"/>
+              <w:spacing w:line="240" w:lineRule="auto"/>
+              <w:rPr/>
+            </w:pPr>
+            <w:r>
+              <w:rPr>
+                <w:rtl w:val="0"/>
+              </w:rPr>
+              <w:t xml:space="preserve">Eventos</w:t>
+            </w:r>
+          </w:p>
+        </w:tc>
+        <w:tc>
+          <w:tcPr>
+            <w:shd w:fill="auto" w:val="clear"/>
+            <w:tcMar>
+              <w:top w:w="100.0" w:type="dxa"/>
+              <w:left w:w="100.0" w:type="dxa"/>
+              <w:bottom w:w="100.0" w:type="dxa"/>
+              <w:right w:w="100.0" w:type="dxa"/>
+            </w:tcMar>
+            <w:vAlign w:val="top"/>
+          </w:tcPr>
+          <w:p>
+            <w:pPr>
+              <w:widowControl w:val="0"/>
+              <w:spacing w:line="240" w:lineRule="auto"/>
+              <w:rPr/>
+            </w:pPr>
+            <w:r>
+              <w:rPr>
+                <w:rtl w:val="0"/>
+              </w:rPr>
+              <w:t xml:space="preserve">id_eventos</w:t>
+            </w:r>
+          </w:p>
+        </w:tc>
+        <w:tc>
+          <w:tcPr>
+            <w:shd w:fill="auto" w:val="clear"/>
+            <w:tcMar>
+              <w:top w:w="100.0" w:type="dxa"/>
+              <w:left w:w="100.0" w:type="dxa"/>
+              <w:bottom w:w="100.0" w:type="dxa"/>
+              <w:right w:w="100.0" w:type="dxa"/>
+            </w:tcMar>
+            <w:vAlign w:val="top"/>
+          </w:tcPr>
+          <w:p>
+            <w:pPr>
+              <w:widowControl w:val="0"/>
+              <w:spacing w:line="240" w:lineRule="auto"/>
+              <w:rPr/>
+            </w:pPr>
+            <w:r>
+              <w:rPr>
+                <w:rtl w:val="0"/>
+              </w:rPr>
+              <w:t xml:space="preserve">Serial</w:t>
+            </w:r>
+          </w:p>
+        </w:tc>
+        <w:tc>
+          <w:tcPr>
+            <w:shd w:fill="auto" w:val="clear"/>
+            <w:tcMar>
+              <w:top w:w="100.0" w:type="dxa"/>
+              <w:left w:w="100.0" w:type="dxa"/>
+              <w:bottom w:w="100.0" w:type="dxa"/>
+              <w:right w:w="100.0" w:type="dxa"/>
+            </w:tcMar>
+            <w:vAlign w:val="top"/>
+          </w:tcPr>
+          <w:p>
+            <w:pPr>
+              <w:widowControl w:val="0"/>
+              <w:spacing w:line="240" w:lineRule="auto"/>
+              <w:rPr/>
+            </w:pPr>
+            <w:r>
+              <w:rPr>
+                <w:rtl w:val="0"/>
+              </w:rPr>
+              <w:t xml:space="preserve">PK</w:t>
+            </w:r>
+          </w:p>
+        </w:tc>
+      </w:tr>
+      <w:tr>
+        <w:trPr>
+          <w:cantSplit w:val="0"/>
+          <w:trHeight w:val="585" w:hRule="atLeast"/>
+          <w:tblHeader w:val="0"/>
+        </w:trPr>
+        <w:tc>
+          <w:tcPr>
+            <w:vMerge w:val="continue"/>
+            <w:shd w:fill="auto" w:val="clear"/>
+            <w:tcMar>
+              <w:top w:w="100.0" w:type="dxa"/>
+              <w:left w:w="100.0" w:type="dxa"/>
+              <w:bottom w:w="100.0" w:type="dxa"/>
+              <w:right w:w="100.0" w:type="dxa"/>
+            </w:tcMar>
+            <w:vAlign w:val="top"/>
+          </w:tcPr>
+          <w:p>
+            <w:pPr>
+              <w:widowControl w:val="0"/>
+              <w:spacing w:after="0" w:before="0" w:line="240" w:lineRule="auto"/>
+              <w:ind w:left="0" w:firstLine="0"/>
+              <w:rPr/>
+            </w:pPr>
+            <w:r>
+              <w:rPr>
+                <w:rtl w:val="0"/>
+              </w:rPr>
+            </w:r>
+          </w:p>
+        </w:tc>
+        <w:tc>
+          <w:tcPr>
+            <w:shd w:fill="auto" w:val="clear"/>
+            <w:tcMar>
+              <w:top w:w="100.0" w:type="dxa"/>
+              <w:left w:w="100.0" w:type="dxa"/>
+              <w:bottom w:w="100.0" w:type="dxa"/>
+              <w:right w:w="100.0" w:type="dxa"/>
+            </w:tcMar>
+            <w:vAlign w:val="top"/>
+          </w:tcPr>
+          <w:p>
+            <w:pPr>
+              <w:widowControl w:val="0"/>
+              <w:spacing w:line="240" w:lineRule="auto"/>
+              <w:rPr/>
+            </w:pPr>
+            <w:r>
+              <w:rPr>
+                <w:rtl w:val="0"/>
+              </w:rPr>
+              <w:t xml:space="preserve">titulo</w:t>
+            </w:r>
+          </w:p>
+        </w:tc>
+        <w:tc>
+          <w:tcPr>
+            <w:shd w:fill="auto" w:val="clear"/>
+            <w:tcMar>
+              <w:top w:w="100.0" w:type="dxa"/>
+              <w:left w:w="100.0" w:type="dxa"/>
+              <w:bottom w:w="100.0" w:type="dxa"/>
+              <w:right w:w="100.0" w:type="dxa"/>
+            </w:tcMar>
+            <w:vAlign w:val="top"/>
+          </w:tcPr>
+          <w:p>
+            <w:pPr>
+              <w:widowControl w:val="0"/>
+              <w:spacing w:line="240" w:lineRule="auto"/>
+              <w:rPr/>
+            </w:pPr>
+            <w:r>
+              <w:rPr>
+                <w:rtl w:val="0"/>
+              </w:rPr>
+              <w:t xml:space="preserve">varchar(100)</w:t>
+            </w:r>
+          </w:p>
+        </w:tc>
+        <w:tc>
+          <w:tcPr>
+            <w:shd w:fill="auto" w:val="clear"/>
+            <w:tcMar>
+              <w:top w:w="100.0" w:type="dxa"/>
+              <w:left w:w="100.0" w:type="dxa"/>
+              <w:bottom w:w="100.0" w:type="dxa"/>
+              <w:right w:w="100.0" w:type="dxa"/>
+            </w:tcMar>
+            <w:vAlign w:val="top"/>
+          </w:tcPr>
+          <w:p>
+            <w:pPr>
+              <w:widowControl w:val="0"/>
+              <w:spacing w:line="240" w:lineRule="auto"/>
+              <w:rPr/>
+            </w:pPr>
+            <w:r>
+              <w:rPr>
+                <w:rtl w:val="0"/>
+              </w:rPr>
+              <w:t xml:space="preserve">NOT NULL</w:t>
+            </w:r>
+          </w:p>
+        </w:tc>
+      </w:tr>
+      <w:tr>
+        <w:trPr>
+          <w:cantSplit w:val="0"/>
+          <w:trHeight w:val="585" w:hRule="atLeast"/>
+          <w:tblHeader w:val="0"/>
+        </w:trPr>
+        <w:tc>
+          <w:tcPr>
+            <w:vMerge w:val="continue"/>
+            <w:shd w:fill="auto" w:val="clear"/>
+            <w:tcMar>
+              <w:top w:w="100.0" w:type="dxa"/>
+              <w:left w:w="100.0" w:type="dxa"/>
+              <w:bottom w:w="100.0" w:type="dxa"/>
+              <w:right w:w="100.0" w:type="dxa"/>
+            </w:tcMar>
+            <w:vAlign w:val="top"/>
+          </w:tcPr>
+          <w:p>
+            <w:pPr>
+              <w:widowControl w:val="0"/>
+              <w:spacing w:after="0" w:before="0" w:line="240" w:lineRule="auto"/>
+              <w:ind w:left="0" w:firstLine="0"/>
+              <w:rPr/>
+            </w:pPr>
+            <w:r>
+              <w:rPr>
+                <w:rtl w:val="0"/>
+              </w:rPr>
+            </w:r>
+          </w:p>
+        </w:tc>
+        <w:tc>
+          <w:tcPr>
+            <w:shd w:fill="auto" w:val="clear"/>
+            <w:tcMar>
+              <w:top w:w="100.0" w:type="dxa"/>
+              <w:left w:w="100.0" w:type="dxa"/>
+              <w:bottom w:w="100.0" w:type="dxa"/>
+              <w:right w:w="100.0" w:type="dxa"/>
+            </w:tcMar>
+            <w:vAlign w:val="top"/>
+          </w:tcPr>
+          <w:p>
+            <w:pPr>
+              <w:widowControl w:val="0"/>
+              <w:spacing w:line="240" w:lineRule="auto"/>
+              <w:rPr/>
+            </w:pPr>
+            <w:r>
+              <w:rPr>
+                <w:rtl w:val="0"/>
+              </w:rPr>
+              <w:t xml:space="preserve">descripcion</w:t>
+            </w:r>
+          </w:p>
+        </w:tc>
+        <w:tc>
+          <w:tcPr>
+            <w:shd w:fill="auto" w:val="clear"/>
+            <w:tcMar>
+              <w:top w:w="100.0" w:type="dxa"/>
+              <w:left w:w="100.0" w:type="dxa"/>
+              <w:bottom w:w="100.0" w:type="dxa"/>
+              <w:right w:w="100.0" w:type="dxa"/>
+            </w:tcMar>
+            <w:vAlign w:val="top"/>
+          </w:tcPr>
+          <w:p>
+            <w:pPr>
+              <w:widowControl w:val="0"/>
+              <w:spacing w:line="240" w:lineRule="auto"/>
+              <w:rPr/>
+            </w:pPr>
+            <w:r>
+              <w:rPr>
+                <w:rtl w:val="0"/>
+              </w:rPr>
+              <w:t xml:space="preserve">text</w:t>
+            </w:r>
+          </w:p>
+        </w:tc>
+        <w:tc>
+          <w:tcPr>
+            <w:shd w:fill="auto" w:val="clear"/>
+            <w:tcMar>
+              <w:top w:w="100.0" w:type="dxa"/>
+              <w:left w:w="100.0" w:type="dxa"/>
+              <w:bottom w:w="100.0" w:type="dxa"/>
+              <w:right w:w="100.0" w:type="dxa"/>
+            </w:tcMar>
+            <w:vAlign w:val="top"/>
+          </w:tcPr>
+          <w:p>
+            <w:pPr>
+              <w:widowControl w:val="0"/>
+              <w:spacing w:line="240" w:lineRule="auto"/>
+              <w:rPr/>
+            </w:pPr>
+            <w:r>
+              <w:rPr>
+                <w:rtl w:val="0"/>
+              </w:rPr>
+              <w:t xml:space="preserve">NOT NULL</w:t>
+            </w:r>
+          </w:p>
+        </w:tc>
+      </w:tr>
+      <w:tr>
+        <w:trPr>
+          <w:cantSplit w:val="0"/>
+          <w:trHeight w:val="585" w:hRule="atLeast"/>
+          <w:tblHeader w:val="0"/>
+        </w:trPr>
+        <w:tc>
+          <w:tcPr>
+            <w:vMerge w:val="continue"/>
+            <w:shd w:fill="auto" w:val="clear"/>
+            <w:tcMar>
+              <w:top w:w="100.0" w:type="dxa"/>
+              <w:left w:w="100.0" w:type="dxa"/>
+              <w:bottom w:w="100.0" w:type="dxa"/>
+              <w:right w:w="100.0" w:type="dxa"/>
+            </w:tcMar>
+            <w:vAlign w:val="top"/>
+          </w:tcPr>
+          <w:p>
+            <w:pPr>
+              <w:widowControl w:val="0"/>
+              <w:spacing w:after="0" w:before="0" w:line="240" w:lineRule="auto"/>
+              <w:ind w:left="0" w:firstLine="0"/>
+              <w:rPr/>
+            </w:pPr>
+            <w:r>
+              <w:rPr>
+                <w:rtl w:val="0"/>
+              </w:rPr>
+            </w:r>
+          </w:p>
+        </w:tc>
+        <w:tc>
+          <w:tcPr>
+            <w:shd w:fill="auto" w:val="clear"/>
+            <w:tcMar>
+              <w:top w:w="100.0" w:type="dxa"/>
+              <w:left w:w="100.0" w:type="dxa"/>
+              <w:bottom w:w="100.0" w:type="dxa"/>
+              <w:right w:w="100.0" w:type="dxa"/>
+            </w:tcMar>
+            <w:vAlign w:val="top"/>
+          </w:tcPr>
+          <w:p>
+            <w:pPr>
+              <w:widowControl w:val="0"/>
+              <w:spacing w:line="240" w:lineRule="auto"/>
+              <w:rPr/>
+            </w:pPr>
+            <w:r>
+              <w:rPr>
+                <w:rtl w:val="0"/>
+              </w:rPr>
+              <w:t xml:space="preserve">fecha_inicio</w:t>
+            </w:r>
+          </w:p>
+        </w:tc>
+        <w:tc>
+          <w:tcPr>
+            <w:shd w:fill="auto" w:val="clear"/>
+            <w:tcMar>
+              <w:top w:w="100.0" w:type="dxa"/>
+              <w:left w:w="100.0" w:type="dxa"/>
+              <w:bottom w:w="100.0" w:type="dxa"/>
+              <w:right w:w="100.0" w:type="dxa"/>
+            </w:tcMar>
+            <w:vAlign w:val="top"/>
+          </w:tcPr>
+          <w:p>
+            <w:pPr>
+              <w:widowControl w:val="0"/>
+              <w:spacing w:line="240" w:lineRule="auto"/>
+              <w:rPr/>
+            </w:pPr>
+            <w:r>
+              <w:rPr>
+                <w:rtl w:val="0"/>
+              </w:rPr>
+              <w:t xml:space="preserve">TIMESTAMP</w:t>
+            </w:r>
+          </w:p>
+        </w:tc>
+        <w:tc>
+          <w:tcPr>
+            <w:shd w:fill="auto" w:val="clear"/>
+            <w:tcMar>
+              <w:top w:w="100.0" w:type="dxa"/>
+              <w:left w:w="100.0" w:type="dxa"/>
+              <w:bottom w:w="100.0" w:type="dxa"/>
+              <w:right w:w="100.0" w:type="dxa"/>
+            </w:tcMar>
+            <w:vAlign w:val="top"/>
+          </w:tcPr>
+          <w:p>
+            <w:pPr>
+              <w:widowControl w:val="0"/>
+              <w:spacing w:line="240" w:lineRule="auto"/>
+              <w:rPr/>
+            </w:pPr>
+            <w:r>
+              <w:rPr>
+                <w:rtl w:val="0"/>
+              </w:rPr>
+              <w:t xml:space="preserve">NOT NULL</w:t>
+            </w:r>
+          </w:p>
+        </w:tc>
+      </w:tr>
+      <w:tr>
+        <w:trPr>
+          <w:cantSplit w:val="0"/>
+          <w:trHeight w:val="570" w:hRule="atLeast"/>
+          <w:tblHeader w:val="0"/>
+        </w:trPr>
+        <w:tc>
+          <w:tcPr>
+            <w:vMerge w:val="continue"/>
+            <w:shd w:fill="auto" w:val="clear"/>
+            <w:tcMar>
+              <w:top w:w="100.0" w:type="dxa"/>
+              <w:left w:w="100.0" w:type="dxa"/>
+              <w:bottom w:w="100.0" w:type="dxa"/>
+              <w:right w:w="100.0" w:type="dxa"/>
+            </w:tcMar>
+            <w:vAlign w:val="top"/>
+          </w:tcPr>
+          <w:p>
+            <w:pPr>
+              <w:widowControl w:val="0"/>
+              <w:spacing w:after="0" w:before="0" w:line="240" w:lineRule="auto"/>
+              <w:ind w:left="0" w:firstLine="0"/>
+              <w:rPr/>
+            </w:pPr>
+            <w:r>
+              <w:rPr>
+                <w:rtl w:val="0"/>
+              </w:rPr>
+            </w:r>
+          </w:p>
+        </w:tc>
+        <w:tc>
+          <w:tcPr>
+            <w:shd w:fill="auto" w:val="clear"/>
+            <w:tcMar>
+              <w:top w:w="100.0" w:type="dxa"/>
+              <w:left w:w="100.0" w:type="dxa"/>
+              <w:bottom w:w="100.0" w:type="dxa"/>
+              <w:right w:w="100.0" w:type="dxa"/>
+            </w:tcMar>
+            <w:vAlign w:val="top"/>
+          </w:tcPr>
+          <w:p>
+            <w:pPr>
+              <w:widowControl w:val="0"/>
+              <w:spacing w:line="240" w:lineRule="auto"/>
+              <w:rPr/>
+            </w:pPr>
+            <w:r>
+              <w:rPr>
+                <w:rtl w:val="0"/>
+              </w:rPr>
+              <w:t xml:space="preserve">fecha_fin</w:t>
+            </w:r>
+          </w:p>
+        </w:tc>
+        <w:tc>
+          <w:tcPr>
+            <w:shd w:fill="auto" w:val="clear"/>
+            <w:tcMar>
+              <w:top w:w="100.0" w:type="dxa"/>
+              <w:left w:w="100.0" w:type="dxa"/>
+              <w:bottom w:w="100.0" w:type="dxa"/>
+              <w:right w:w="100.0" w:type="dxa"/>
+            </w:tcMar>
+            <w:vAlign w:val="top"/>
+          </w:tcPr>
+          <w:p>
+            <w:pPr>
+              <w:widowControl w:val="0"/>
+              <w:spacing w:line="240" w:lineRule="auto"/>
+              <w:rPr/>
+            </w:pPr>
+            <w:r>
+              <w:rPr>
+                <w:rtl w:val="0"/>
+              </w:rPr>
+              <w:t xml:space="preserve">TIMESTAMP</w:t>
+            </w:r>
+          </w:p>
+        </w:tc>
+        <w:tc>
+          <w:tcPr>
+            <w:shd w:fill="auto" w:val="clear"/>
+            <w:tcMar>
+              <w:top w:w="100.0" w:type="dxa"/>
+              <w:left w:w="100.0" w:type="dxa"/>
+              <w:bottom w:w="100.0" w:type="dxa"/>
+              <w:right w:w="100.0" w:type="dxa"/>
+            </w:tcMar>
+            <w:vAlign w:val="top"/>
+          </w:tcPr>
+          <w:p>
+            <w:pPr>
+              <w:widowControl w:val="0"/>
+              <w:spacing w:line="240" w:lineRule="auto"/>
+              <w:rPr/>
+            </w:pPr>
+            <w:r>
+              <w:rPr>
+                <w:rtl w:val="0"/>
+              </w:rPr>
+              <w:t xml:space="preserve">NOT NULL CHECK (fecha_fin&gt;=fecha_inicio)</w:t>
+            </w:r>
+          </w:p>
+        </w:tc>
+      </w:tr>
+      <w:tr>
+        <w:trPr>
+          <w:cantSplit w:val="0"/>
+          <w:trHeight w:val="585" w:hRule="atLeast"/>
+          <w:tblHeader w:val="0"/>
+        </w:trPr>
+        <w:tc>
+          <w:tcPr>
+            <w:vMerge w:val="continue"/>
+            <w:shd w:fill="auto" w:val="clear"/>
+            <w:tcMar>
+              <w:top w:w="100.0" w:type="dxa"/>
+              <w:left w:w="100.0" w:type="dxa"/>
+              <w:bottom w:w="100.0" w:type="dxa"/>
+              <w:right w:w="100.0" w:type="dxa"/>
+            </w:tcMar>
+            <w:vAlign w:val="top"/>
+          </w:tcPr>
+          <w:p>
+            <w:pPr>
+              <w:widowControl w:val="0"/>
+              <w:spacing w:after="0" w:before="0" w:line="240" w:lineRule="auto"/>
+              <w:ind w:left="0" w:firstLine="0"/>
+              <w:rPr/>
+            </w:pPr>
+            <w:r>
+              <w:rPr>
+                <w:rtl w:val="0"/>
+              </w:rPr>
+            </w:r>
+          </w:p>
+        </w:tc>
+        <w:tc>
+          <w:tcPr>
+            <w:shd w:fill="auto" w:val="clear"/>
+            <w:tcMar>
+              <w:top w:w="100.0" w:type="dxa"/>
+              <w:left w:w="100.0" w:type="dxa"/>
+              <w:bottom w:w="100.0" w:type="dxa"/>
+              <w:right w:w="100.0" w:type="dxa"/>
+            </w:tcMar>
+            <w:vAlign w:val="top"/>
+          </w:tcPr>
+          <w:p>
+            <w:pPr>
+              <w:widowControl w:val="0"/>
+              <w:spacing w:line="240" w:lineRule="auto"/>
+              <w:rPr/>
+            </w:pPr>
+            <w:r>
+              <w:rPr>
+                <w:rtl w:val="0"/>
+              </w:rPr>
+              <w:t xml:space="preserve">id_usuario_propietario</w:t>
+            </w:r>
+          </w:p>
+        </w:tc>
+        <w:tc>
+          <w:tcPr>
+            <w:shd w:fill="auto" w:val="clear"/>
+            <w:tcMar>
+              <w:top w:w="100.0" w:type="dxa"/>
+              <w:left w:w="100.0" w:type="dxa"/>
+              <w:bottom w:w="100.0" w:type="dxa"/>
+              <w:right w:w="100.0" w:type="dxa"/>
+            </w:tcMar>
+            <w:vAlign w:val="top"/>
+          </w:tcPr>
+          <w:p>
+            <w:pPr>
+              <w:widowControl w:val="0"/>
+              <w:spacing w:line="240" w:lineRule="auto"/>
+              <w:rPr/>
+            </w:pPr>
+            <w:r>
+              <w:rPr>
+                <w:rtl w:val="0"/>
+              </w:rPr>
+              <w:t xml:space="preserve">int</w:t>
+            </w:r>
+          </w:p>
+        </w:tc>
+        <w:tc>
+          <w:tcPr>
+            <w:shd w:fill="auto" w:val="clear"/>
+            <w:tcMar>
+              <w:top w:w="100.0" w:type="dxa"/>
+              <w:left w:w="100.0" w:type="dxa"/>
+              <w:bottom w:w="100.0" w:type="dxa"/>
+              <w:right w:w="100.0" w:type="dxa"/>
+            </w:tcMar>
+            <w:vAlign w:val="top"/>
+          </w:tcPr>
+          <w:p>
+            <w:pPr>
+              <w:widowControl w:val="0"/>
+              <w:spacing w:line="240" w:lineRule="auto"/>
+              <w:rPr/>
+            </w:pPr>
+            <w:r>
+              <w:rPr>
+                <w:rFonts w:ascii="Arial Unicode MS" w:cs="Arial Unicode MS" w:eastAsia="Arial Unicode MS" w:hAnsi="Arial Unicode MS"/>
+                <w:rtl w:val="0"/>
+              </w:rPr>
+              <w:t xml:space="preserve">FK → usuarios(id_usuarios)</w:t>
+            </w:r>
+          </w:p>
+        </w:tc>
+      </w:tr>
+      <w:tr>
+        <w:trPr>
+          <w:cantSplit w:val="0"/>
+          <w:trHeight w:val="585" w:hRule="atLeast"/>
+          <w:tblHeader w:val="0"/>
+        </w:trPr>
+        <w:tc>
+          <w:tcPr>
+            <w:vMerge w:val="continue"/>
+            <w:shd w:fill="auto" w:val="clear"/>
+            <w:tcMar>
+              <w:top w:w="100.0" w:type="dxa"/>
+              <w:left w:w="100.0" w:type="dxa"/>
+              <w:bottom w:w="100.0" w:type="dxa"/>
+              <w:right w:w="100.0" w:type="dxa"/>
+            </w:tcMar>
+            <w:vAlign w:val="top"/>
+          </w:tcPr>
+          <w:p>
+            <w:pPr>
+              <w:widowControl w:val="0"/>
+              <w:spacing w:after="0" w:before="0" w:line="240" w:lineRule="auto"/>
+              <w:ind w:left="0" w:firstLine="0"/>
+              <w:rPr/>
+            </w:pPr>
+            <w:r>
+              <w:rPr>
+                <w:rtl w:val="0"/>
+              </w:rPr>
+            </w:r>
+          </w:p>
+        </w:tc>
+        <w:tc>
+          <w:tcPr>
+            <w:shd w:fill="auto" w:val="clear"/>
+            <w:tcMar>
+              <w:top w:w="100.0" w:type="dxa"/>
+              <w:left w:w="100.0" w:type="dxa"/>
+              <w:bottom w:w="100.0" w:type="dxa"/>
+              <w:right w:w="100.0" w:type="dxa"/>
+            </w:tcMar>
+            <w:vAlign w:val="top"/>
+          </w:tcPr>
+          <w:p>
+            <w:pPr>
+              <w:widowControl w:val="0"/>
+              <w:spacing w:line="240" w:lineRule="auto"/>
+              <w:rPr/>
+            </w:pPr>
+            <w:r>
+              <w:rPr>
+                <w:rtl w:val="0"/>
+              </w:rPr>
+              <w:t xml:space="preserve">id_categoria</w:t>
+            </w:r>
+          </w:p>
+        </w:tc>
+        <w:tc>
+          <w:tcPr>
+            <w:shd w:fill="auto" w:val="clear"/>
+            <w:tcMar>
+              <w:top w:w="100.0" w:type="dxa"/>
+              <w:left w:w="100.0" w:type="dxa"/>
+              <w:bottom w:w="100.0" w:type="dxa"/>
+              <w:right w:w="100.0" w:type="dxa"/>
+            </w:tcMar>
+            <w:vAlign w:val="top"/>
+          </w:tcPr>
+          <w:p>
+            <w:pPr>
+              <w:widowControl w:val="0"/>
+              <w:spacing w:line="240" w:lineRule="auto"/>
+              <w:rPr/>
+            </w:pPr>
+            <w:r>
+              <w:rPr>
+                <w:rtl w:val="0"/>
+              </w:rPr>
+              <w:t xml:space="preserve">int</w:t>
+            </w:r>
+          </w:p>
+        </w:tc>
+        <w:tc>
+          <w:tcPr>
+            <w:shd w:fill="auto" w:val="clear"/>
+            <w:tcMar>
+              <w:top w:w="100.0" w:type="dxa"/>
+              <w:left w:w="100.0" w:type="dxa"/>
+              <w:bottom w:w="100.0" w:type="dxa"/>
+              <w:right w:w="100.0" w:type="dxa"/>
+            </w:tcMar>
+            <w:vAlign w:val="top"/>
+          </w:tcPr>
+          <w:p>
+            <w:pPr>
+              <w:widowControl w:val="0"/>
+              <w:spacing w:line="240" w:lineRule="auto"/>
+              <w:rPr/>
+            </w:pPr>
+            <w:r>
+              <w:rPr>
+                <w:rFonts w:ascii="Arial Unicode MS" w:cs="Arial Unicode MS" w:eastAsia="Arial Unicode MS" w:hAnsi="Arial Unicode MS"/>
+                <w:rtl w:val="0"/>
+              </w:rPr>
+              <w:t xml:space="preserve">FK → categoria(id_categoria)</w:t>
+            </w:r>
+          </w:p>
+        </w:tc>
+      </w:tr>
+      <w:tr>
+        <w:trPr>
+          <w:cantSplit w:val="0"/>
+          <w:trHeight w:val="585" w:hRule="atLeast"/>
+          <w:tblHeader w:val="0"/>
+        </w:trPr>
+        <w:tc>
+          <w:tcPr>
+            <w:vMerge w:val="continue"/>
+            <w:shd w:fill="auto" w:val="clear"/>
+            <w:tcMar>
+              <w:top w:w="100.0" w:type="dxa"/>
+              <w:left w:w="100.0" w:type="dxa"/>
+              <w:bottom w:w="100.0" w:type="dxa"/>
+              <w:right w:w="100.0" w:type="dxa"/>
+            </w:tcMar>
+            <w:vAlign w:val="top"/>
+          </w:tcPr>
+          <w:p>
+            <w:pPr>
+              <w:widowControl w:val="0"/>
+              <w:spacing w:after="0" w:before="0" w:line="240" w:lineRule="auto"/>
+              <w:ind w:left="0" w:firstLine="0"/>
+              <w:rPr/>
+            </w:pPr>
+            <w:r>
+              <w:rPr>
+                <w:rtl w:val="0"/>
+              </w:rPr>
+            </w:r>
+          </w:p>
+        </w:tc>
+        <w:tc>
+          <w:tcPr>
+            <w:shd w:fill="6aa84f" w:val="clear"/>
+            <w:tcMar>
+              <w:top w:w="100.0" w:type="dxa"/>
+              <w:left w:w="100.0" w:type="dxa"/>
+              <w:bottom w:w="100.0" w:type="dxa"/>
+              <w:right w:w="100.0" w:type="dxa"/>
+            </w:tcMar>
+            <w:vAlign w:val="top"/>
+          </w:tcPr>
+          <w:p>
+            <w:pPr>
+              <w:widowControl w:val="0"/>
+              <w:spacing w:line="240" w:lineRule="auto"/>
+              <w:rPr>
+                <w:b w:val="1"/>
+                <w:bCs w:val="1"/>
+              </w:rPr>
+            </w:pPr>
+            <w:r>
+              <w:rPr>
+                <w:b w:val="1"/>
+                <w:bCs w:val="1"/>
+                <w:rtl w:val="0"/>
+              </w:rPr>
+              <w:t xml:space="preserve">id_ubicacion</w:t>
+            </w:r>
+          </w:p>
+        </w:tc>
+        <w:tc>
+          <w:tcPr>
+            <w:shd w:fill="6aa84f" w:val="clear"/>
+            <w:tcMar>
+              <w:top w:w="100.0" w:type="dxa"/>
+              <w:left w:w="100.0" w:type="dxa"/>
+              <w:bottom w:w="100.0" w:type="dxa"/>
+              <w:right w:w="100.0" w:type="dxa"/>
+            </w:tcMar>
+            <w:vAlign w:val="top"/>
+          </w:tcPr>
+          <w:p>
+            <w:pPr>
+              <w:widowControl w:val="0"/>
+              <w:spacing w:line="240" w:lineRule="auto"/>
+              <w:rPr/>
+            </w:pPr>
+            <w:r>
+              <w:rPr>
+                <w:rtl w:val="0"/>
+              </w:rPr>
+              <w:t xml:space="preserve">int</w:t>
+            </w:r>
+          </w:p>
+        </w:tc>
+        <w:tc>
+          <w:tcPr>
+            <w:shd w:fill="6aa84f" w:val="clear"/>
+            <w:tcMar>
+              <w:top w:w="100.0" w:type="dxa"/>
+              <w:left w:w="100.0" w:type="dxa"/>
+              <w:bottom w:w="100.0" w:type="dxa"/>
+              <w:right w:w="100.0" w:type="dxa"/>
+            </w:tcMar>
+            <w:vAlign w:val="top"/>
+          </w:tcPr>
+          <w:p>
+            <w:pPr>
+              <w:widowControl w:val="0"/>
+              <w:spacing w:line="240" w:lineRule="auto"/>
+              <w:rPr/>
+            </w:pPr>
+            <w:r>
+              <w:rPr>
+                <w:rFonts w:ascii="Arial Unicode MS" w:cs="Arial Unicode MS" w:eastAsia="Arial Unicode MS" w:hAnsi="Arial Unicode MS"/>
+                <w:rtl w:val="0"/>
+              </w:rPr>
+              <w:t xml:space="preserve">FK→ ubicaciones(id_ubicacion)</w:t>
+            </w:r>
+          </w:p>
+        </w:tc>
+      </w:tr>
+    </w:tbl>
+    <w:p>
+      <w:pPr>
+        <w:rPr/>
+      </w:pPr>
+      <w:r>
+        <w:rPr>
+          <w:rtl w:val="0"/>
+        </w:rPr>
+      </w:r>
+    </w:p>
+    <w:p>
+      <w:pPr>
+        <w:pStyle w:val="Heading4"/>
+        <w:keepNext w:val="0"/>
+        <w:keepLines w:val="0"/>
+        <w:rPr>
+          <w:color w:val="000000"/>
+          <w:sz w:val="22"/>
+          <w:szCs w:val="22"/>
+        </w:rPr>
+      </w:pPr>
+      <w:bookmarkStart w:colFirst="0" w:colLast="0" w:name="_b0aobtfqdzb0" w:id="2"/>
+      <w:bookmarkEnd w:id="2"/>
+      <w:r>
+        <w:rPr>
+          <w:color w:val="000000"/>
+          <w:sz w:val="22"/>
+          <w:szCs w:val="22"/>
+          <w:rtl w:val="0"/>
+        </w:rPr>
+        <w:t xml:space="preserve">Vistas y abstracciones para la lógica de negocio</w:t>
+      </w:r>
+    </w:p>
+    <w:p>
+      <w:pPr>
+        <w:rPr/>
+      </w:pPr>
+      <w:r>
+        <w:rPr>
+          <w:rtl w:val="0"/>
+        </w:rPr>
+      </w:r>
+    </w:p>
+    <w:tbl>
+      <w:tblPr>
+        <w:tblStyle w:val="Table3"/>
+        <w:tblW w:w="9029.0" w:type="dxa"/>
+        <w:jc w:val="left"/>
+        <w:tblBorders>
+          <w:top w:color="000000" w:space="0" w:sz="8" w:val="single"/>
+          <w:left w:color="000000" w:space="0" w:sz="8" w:val="single"/>
+          <w:bottom w:color="000000" w:space="0" w:sz="8" w:val="single"/>
+          <w:right w:color="000000" w:space="0" w:sz="8" w:val="single"/>
+          <w:insideH w:color="000000" w:space="0" w:sz="8" w:val="single"/>
+          <w:insideV w:color="000000" w:space="0" w:sz="8" w:val="single"/>
+        </w:tblBorders>
+        <w:tblLayout w:type="fixed"/>
+        <w:tblLook w:val="0600"/>
+      </w:tblPr>
+      <w:tblGrid>
+        <w:gridCol w:w="4514.5"/>
+        <w:gridCol w:w="4514.5"/>
+        <w:tblGridChange w:id="0">
+          <w:tblGrid>
+            <w:gridCol w:w="4514.5"/>
+            <w:gridCol w:w="4514.5"/>
+          </w:tblGrid>
+        </w:tblGridChange>
+      </w:tblGrid>
+      <w:tr>
+        <w:trPr>
+          <w:cantSplit w:val="0"/>
+          <w:tblHeader w:val="0"/>
+        </w:trPr>
+        <w:tc>
+          <w:tcPr>
+            <w:shd w:fill="auto" w:val="clear"/>
+            <w:tcMar>
+              <w:top w:w="100.0" w:type="dxa"/>
+              <w:left w:w="100.0" w:type="dxa"/>
+              <w:bottom w:w="100.0" w:type="dxa"/>
+              <w:right w:w="100.0" w:type="dxa"/>
+            </w:tcMar>
+            <w:vAlign w:val="top"/>
+          </w:tcPr>
+          <w:p>
+            <w:pPr>
+              <w:keepNext w:val="0"/>
+              <w:keepLines w:val="0"/>
+              <w:pageBreakBefore w:val="0"/>
+              <w:widowControl w:val="0"/>
+              <w:pBdr>
+                <w:top w:space="0" w:sz="0" w:val="nil"/>
+                <w:left w:space="0" w:sz="0" w:val="nil"/>
+                <w:bottom w:space="0" w:sz="0" w:val="nil"/>
+                <w:right w:space="0" w:sz="0" w:val="nil"/>
+                <w:between w:space="0" w:sz="0" w:val="nil"/>
+              </w:pBdr>
+              <w:shd w:fill="auto" w:val="clear"/>
+              <w:spacing w:after="0" w:before="0" w:line="240" w:lineRule="auto"/>
+              <w:ind w:left="0" w:right="0" w:firstLine="0"/>
+              <w:jc w:val="left"/>
+              <w:rPr/>
+            </w:pPr>
+            <w:r>
+              <w:rPr>
+                <w:rtl w:val="0"/>
+              </w:rPr>
+              <w:t xml:space="preserve">Componente</w:t>
+            </w:r>
+          </w:p>
+        </w:tc>
+        <w:tc>
+          <w:tcPr>
+            <w:shd w:fill="auto" w:val="clear"/>
+            <w:tcMar>
+              <w:top w:w="100.0" w:type="dxa"/>
+              <w:left w:w="100.0" w:type="dxa"/>
+              <w:bottom w:w="100.0" w:type="dxa"/>
+              <w:right w:w="100.0" w:type="dxa"/>
+            </w:tcMar>
+            <w:vAlign w:val="top"/>
+          </w:tcPr>
+          <w:p>
+            <w:pPr>
+              <w:keepNext w:val="0"/>
+              <w:keepLines w:val="0"/>
+              <w:pageBreakBefore w:val="0"/>
+              <w:widowControl w:val="0"/>
+              <w:pBdr>
+                <w:top w:space="0" w:sz="0" w:val="nil"/>
+                <w:left w:space="0" w:sz="0" w:val="nil"/>
+                <w:bottom w:space="0" w:sz="0" w:val="nil"/>
+                <w:right w:space="0" w:sz="0" w:val="nil"/>
+                <w:between w:space="0" w:sz="0" w:val="nil"/>
+              </w:pBdr>
+              <w:shd w:fill="auto" w:val="clear"/>
+              <w:spacing w:after="0" w:before="0" w:line="240" w:lineRule="auto"/>
+              <w:ind w:left="0" w:right="0" w:firstLine="0"/>
+              <w:jc w:val="left"/>
+              <w:rPr/>
+            </w:pPr>
+            <w:r>
+              <w:rPr>
+                <w:rtl w:val="0"/>
+              </w:rPr>
+              <w:t xml:space="preserve">Detalles de la especificación</w:t>
+            </w:r>
+          </w:p>
+        </w:tc>
+      </w:tr>
+      <w:tr>
+        <w:trPr>
+          <w:cantSplit w:val="0"/>
+          <w:tblHeader w:val="0"/>
+        </w:trPr>
+        <w:tc>
+          <w:tcPr>
+            <w:shd w:fill="auto" w:val="clear"/>
+            <w:tcMar>
+              <w:top w:w="100.0" w:type="dxa"/>
+              <w:left w:w="100.0" w:type="dxa"/>
+              <w:bottom w:w="100.0" w:type="dxa"/>
+              <w:right w:w="100.0" w:type="dxa"/>
+            </w:tcMar>
+            <w:vAlign w:val="top"/>
+          </w:tcPr>
+          <w:p>
+            <w:pPr>
+              <w:keepNext w:val="0"/>
+              <w:keepLines w:val="0"/>
+              <w:pageBreakBefore w:val="0"/>
+              <w:widowControl w:val="0"/>
+              <w:pBdr>
+                <w:top w:space="0" w:sz="0" w:val="nil"/>
+                <w:left w:space="0" w:sz="0" w:val="nil"/>
+                <w:bottom w:space="0" w:sz="0" w:val="nil"/>
+                <w:right w:space="0" w:sz="0" w:val="nil"/>
+                <w:between w:space="0" w:sz="0" w:val="nil"/>
+              </w:pBdr>
+              <w:shd w:fill="auto" w:val="clear"/>
+              <w:spacing w:after="0" w:before="0" w:line="240" w:lineRule="auto"/>
+              <w:ind w:left="0" w:right="0" w:firstLine="0"/>
+              <w:jc w:val="left"/>
+              <w:rPr/>
+            </w:pPr>
+            <w:r>
+              <w:rPr>
+                <w:rtl w:val="0"/>
+              </w:rPr>
+              <w:t xml:space="preserve">trg_evitar_traslapes</w:t>
+            </w:r>
+          </w:p>
+        </w:tc>
+        <w:tc>
+          <w:tcPr>
+            <w:shd w:fill="auto" w:val="clear"/>
+            <w:tcMar>
+              <w:top w:w="100.0" w:type="dxa"/>
+              <w:left w:w="100.0" w:type="dxa"/>
+              <w:bottom w:w="100.0" w:type="dxa"/>
+              <w:right w:w="100.0" w:type="dxa"/>
+            </w:tcMar>
+            <w:vAlign w:val="top"/>
+          </w:tcPr>
+          <w:p>
+            <w:pPr>
+              <w:keepNext w:val="0"/>
+              <w:keepLines w:val="0"/>
+              <w:pageBreakBefore w:val="0"/>
+              <w:widowControl w:val="0"/>
+              <w:pBdr>
+                <w:top w:space="0" w:sz="0" w:val="nil"/>
+                <w:left w:space="0" w:sz="0" w:val="nil"/>
+                <w:bottom w:space="0" w:sz="0" w:val="nil"/>
+                <w:right w:space="0" w:sz="0" w:val="nil"/>
+                <w:between w:space="0" w:sz="0" w:val="nil"/>
+              </w:pBdr>
+              <w:shd w:fill="auto" w:val="clear"/>
+              <w:spacing w:after="0" w:before="0" w:line="240" w:lineRule="auto"/>
+              <w:ind w:left="0" w:right="0" w:firstLine="0"/>
+              <w:jc w:val="left"/>
+              <w:rPr/>
+            </w:pPr>
+            <w:r>
+              <w:rPr>
+                <w:rtl w:val="0"/>
+              </w:rPr>
+              <w:t xml:space="preserve">Mediante un trigger de tipo BEFORE INSERT OR UPDATE que actúa en la tabla EVENTOS se intercepta cualquier intento por crear reuniones nuevas o modificaciones que choquen en horario y ubicación con otras que ya existen, si sucede esto, el motor aborta la transacción.</w:t>
+            </w:r>
+          </w:p>
+        </w:tc>
+      </w:tr>
+    </w:tbl>
+    <w:p>
+      <w:pPr>
         <w:rPr/>
       </w:pPr>
       <w:r>
@@ -1783,6 +4077,27 @@
       <w:sz w:val="30"/>
       <w:szCs w:val="30"/>
     </w:rPr>
+  </w:style>
+  <w:style w:type="table" w:styleId="Table1">
+    <w:basedOn w:val="TableNormal"/>
+    <w:tblPr>
+      <w:tblStyleRowBandSize w:val="1"/>
+      <w:tblStyleColBandSize w:val="1"/>
+    </w:tblPr>
+  </w:style>
+  <w:style w:type="table" w:styleId="Table2">
+    <w:basedOn w:val="TableNormal"/>
+    <w:tblPr>
+      <w:tblStyleRowBandSize w:val="1"/>
+      <w:tblStyleColBandSize w:val="1"/>
+    </w:tblPr>
+  </w:style>
+  <w:style w:type="table" w:styleId="Table3">
+    <w:basedOn w:val="TableNormal"/>
+    <w:tblPr>
+      <w:tblStyleRowBandSize w:val="1"/>
+      <w:tblStyleColBandSize w:val="1"/>
+    </w:tblPr>
   </w:style>
 </w:styles>
 </file>

</xml_diff>

<commit_message>
Se termino la documentación del modelo físico del RF-10
</commit_message>
<xml_diff>
--- a/Docs/Proyecto 1 Documentación.docx
+++ b/Docs/Proyecto 1 Documentación.docx
@@ -3146,7 +3146,7 @@
                 <w:bCs w:val="1"/>
                 <w:rtl w:val="0"/>
               </w:rPr>
-              <w:t xml:space="preserve">id_ubicacion</w:t>
+              <w:t xml:space="preserve">id_ubicacion (RF-08)</w:t>
             </w:r>
           </w:p>
         </w:tc>
@@ -3393,7 +3393,7 @@
               <w:rPr>
                 <w:rtl w:val="0"/>
               </w:rPr>
-              <w:t xml:space="preserve">trg_evitar_traslapes</w:t>
+              <w:t xml:space="preserve">trg_evitar_traslapes (RF-09)</w:t>
             </w:r>
           </w:p>
         </w:tc>
@@ -3436,7 +3436,99 @@
           </w:p>
         </w:tc>
       </w:tr>
+      <w:tr>
+        <w:trPr>
+          <w:cantSplit w:val="0"/>
+          <w:tblHeader w:val="0"/>
+        </w:trPr>
+        <w:tc>
+          <w:tcPr>
+            <w:shd w:fill="auto" w:val="clear"/>
+            <w:tcMar>
+              <w:top w:w="100.0" w:type="dxa"/>
+              <w:left w:w="100.0" w:type="dxa"/>
+              <w:bottom w:w="100.0" w:type="dxa"/>
+              <w:right w:w="100.0" w:type="dxa"/>
+            </w:tcMar>
+            <w:vAlign w:val="top"/>
+          </w:tcPr>
+          <w:p>
+            <w:pPr>
+              <w:keepNext w:val="0"/>
+              <w:keepLines w:val="0"/>
+              <w:pageBreakBefore w:val="0"/>
+              <w:widowControl w:val="0"/>
+              <w:pBdr>
+                <w:top w:space="0" w:sz="0" w:val="nil"/>
+                <w:left w:space="0" w:sz="0" w:val="nil"/>
+                <w:bottom w:space="0" w:sz="0" w:val="nil"/>
+                <w:right w:space="0" w:sz="0" w:val="nil"/>
+                <w:between w:space="0" w:sz="0" w:val="nil"/>
+              </w:pBdr>
+              <w:shd w:fill="auto" w:val="clear"/>
+              <w:spacing w:after="0" w:before="0" w:line="240" w:lineRule="auto"/>
+              <w:ind w:left="0" w:right="0" w:firstLine="0"/>
+              <w:jc w:val="left"/>
+              <w:rPr/>
+            </w:pPr>
+            <w:r>
+              <w:rPr>
+                <w:rtl w:val="0"/>
+              </w:rPr>
+              <w:t xml:space="preserve">ubicaciones_mas_utilizadas (vista) (RF-10)</w:t>
+            </w:r>
+          </w:p>
+        </w:tc>
+        <w:tc>
+          <w:tcPr>
+            <w:shd w:fill="auto" w:val="clear"/>
+            <w:tcMar>
+              <w:top w:w="100.0" w:type="dxa"/>
+              <w:left w:w="100.0" w:type="dxa"/>
+              <w:bottom w:w="100.0" w:type="dxa"/>
+              <w:right w:w="100.0" w:type="dxa"/>
+            </w:tcMar>
+            <w:vAlign w:val="top"/>
+          </w:tcPr>
+          <w:p>
+            <w:pPr>
+              <w:keepNext w:val="0"/>
+              <w:keepLines w:val="0"/>
+              <w:pageBreakBefore w:val="0"/>
+              <w:widowControl w:val="0"/>
+              <w:pBdr>
+                <w:top w:space="0" w:sz="0" w:val="nil"/>
+                <w:left w:space="0" w:sz="0" w:val="nil"/>
+                <w:bottom w:space="0" w:sz="0" w:val="nil"/>
+                <w:right w:space="0" w:sz="0" w:val="nil"/>
+                <w:between w:space="0" w:sz="0" w:val="nil"/>
+              </w:pBdr>
+              <w:shd w:fill="auto" w:val="clear"/>
+              <w:spacing w:after="0" w:before="0" w:line="240" w:lineRule="auto"/>
+              <w:ind w:left="0" w:right="0" w:firstLine="0"/>
+              <w:jc w:val="left"/>
+              <w:rPr/>
+            </w:pPr>
+            <w:r>
+              <w:rPr>
+                <w:rtl w:val="0"/>
+              </w:rPr>
+              <w:t xml:space="preserve">Actúa como consulta precompilada lista para ser llamada por Python para mostrar al usuario el ranking de las ubicaciones que han tenido más eventos a lo largo del tiempo. Se juntaron las tablas temporalmente con JOIN conectando id_ubicacion en las tablas EVENTOS y UBICACION, se agruparon por el nombre de ubicación con un GROUP BY, se contó la cantidad de eventos en esa ubicación con un SELECT COUNT() y se ordenó de forma descendente con un ORDER BY DESC. </w:t>
+            </w:r>
+          </w:p>
+        </w:tc>
+      </w:tr>
     </w:tbl>
+    <w:p>
+      <w:pPr>
+        <w:rPr/>
+      </w:pPr>
+      <w:r>
+        <w:rPr>
+          <w:rtl w:val="0"/>
+        </w:rPr>
+      </w:r>
+    </w:p>
     <w:p>
       <w:pPr>
         <w:rPr/>

</xml_diff>